<commit_message>
Polish final v6 manuscript presentation
</commit_message>
<xml_diff>
--- a/manuscript/docx/LOX_thymus_aging_public_preprint_v6_final.docx
+++ b/manuscript/docx/LOX_thymus_aging_public_preprint_v6_final.docx
@@ -2,7 +2,7 @@
 <file path=word/document.xml><?xml version="1.0" encoding="utf-8"?>
 <w:document xmlns:w="http://schemas.openxmlformats.org/wordprocessingml/2006/main" xmlns:m="http://schemas.openxmlformats.org/officeDocument/2006/math" xmlns:r="http://schemas.openxmlformats.org/officeDocument/2006/relationships" xmlns:o="urn:schemas-microsoft-com:office:office" xmlns:v="urn:schemas-microsoft-com:vml" xmlns:w10="urn:schemas-microsoft-com:office:word" xmlns:a="http://schemas.openxmlformats.org/drawingml/2006/main" xmlns:pic="http://schemas.openxmlformats.org/drawingml/2006/picture" xmlns:wp="http://schemas.openxmlformats.org/drawingml/2006/wordprocessingDrawing">
   <w:body>
-    <w:bookmarkStart w:id="69" w:name="Xaa0f89a076165c40bf5e157940c3c851d392529"/>
+    <w:bookmarkStart w:id="78" w:name="Xaa0f89a076165c40bf5e157940c3c851d392529"/>
     <w:p>
       <w:pPr>
         <w:pStyle w:val="Heading1"/>
@@ -49,7 +49,13 @@
         <w:br/>
       </w:r>
       <w:r>
-        <w:t xml:space="preserve">Correspondence:</w:t>
+        <w:t xml:space="preserve">Correspondence: Aliaksandr Karatseyeu</w:t>
+      </w:r>
+      <w:r>
+        <w:br/>
+      </w:r>
+      <w:r>
+        <w:t xml:space="preserve">Code and materials:</w:t>
       </w:r>
       <w:r>
         <w:t xml:space="preserve"> </w:t>
@@ -59,7 +65,7 @@
           <w:rPr>
             <w:rStyle w:val="Hyperlink"/>
           </w:rPr>
-          <w:t xml:space="preserve">ThymusLOXScan repository</w:t>
+          <w:t xml:space="preserve">github.com/G1F12/ThymusLOXScan</w:t>
         </w:r>
       </w:hyperlink>
     </w:p>
@@ -78,23 +84,7 @@
         <w:t xml:space="preserve"> </w:t>
       </w:r>
       <w:r>
-        <w:t xml:space="preserve">v6.0 final computational preprint</w:t>
-      </w:r>
-      <w:r>
-        <w:br/>
-      </w:r>
-      <w:r>
-        <w:rPr>
-          <w:b/>
-          <w:bCs/>
-        </w:rPr>
-        <w:t xml:space="preserve">Status:</w:t>
-      </w:r>
-      <w:r>
-        <w:t xml:space="preserve"> </w:t>
-      </w:r>
-      <w:r>
-        <w:t xml:space="preserve">Public-release package prepared; version DOI not assigned</w:t>
+        <w:t xml:space="preserve">6.0</w:t>
       </w:r>
     </w:p>
     <w:bookmarkStart w:id="11" w:name="abstract"/>
@@ -111,7 +101,7 @@
         <w:pStyle w:val="FirstParagraph"/>
       </w:pPr>
       <w:r>
-        <w:t xml:space="preserve">Age-associated thymic involution involves changes in epithelial and mesenchymal stromal compartments, but the behavior of extracellular-matrix-associated lysyl oxidase (LOX) family transcripts at stromal-subtype resolution is incompletely described. We performed a computational reanalysis of the public GSE240016 single-cell RNA-sequencing dataset of 22,932 CD45-negative thymic stromal cells from young and aged female mice, using sample-level pseudobulk inference and frozen sensitivity assessments. Four focal aged-versus-young estimates were retained: lower</w:t>
+        <w:t xml:space="preserve">Age-associated thymic involution involves epithelial and mesenchymal stromal changes, but lysyl oxidase (LOX) family transcripts have not been well described at stromal-subtype resolution. We computationally reanalyzed 22,932 CD45-negative thymic stromal cells from young and aged female mice in the public GSE240016 single-cell RNA-sequencing dataset, using sample-level pseudobulk inference and frozen sensitivity assessments. Four focal aged-versus-young directions were retained: lower</w:t>
       </w:r>
       <w:r>
         <w:t xml:space="preserve"> </w:t>
@@ -126,7 +116,7 @@
         <w:t xml:space="preserve"> </w:t>
       </w:r>
       <w:r>
-        <w:t xml:space="preserve">in capsular fibroblasts (log2 fold change -1.456; three young and three aged samples), lower</w:t>
+        <w:t xml:space="preserve">in capsular fibroblasts (log2 fold change -1.456; three young and three aged sample labels), lower</w:t>
       </w:r>
       <w:r>
         <w:t xml:space="preserve"> </w:t>
@@ -171,7 +161,7 @@
         <w:t xml:space="preserve"> </w:t>
       </w:r>
       <w:r>
-        <w:t xml:space="preserve">in mTEC1 (-3.286; 2+2). Their grades A, B+, B, and C, respectively, describe internal computational robustness only. The frozen quality-control, leave-one-library-out, sparse-gene, and annotation-confidence assessments preserved focal directions where estimable, while retaining small-sample, sparse-detection, annotation, and unresolved age-batch limitations. Independent mouse datasets supplied broad fibroblast, broad epithelial, or related TEC-subtype context; none supplied an exact capsFB, medFB, or mTEC1 comparison. An integrity-gated analysis of GSE231906 was limited to within-expression-unit human detection context among uniquely joined barcodes because independent donor identity could not be established. External evidence was mixed or contextual. This study is hypothesis-generating, and orthogonal experimental follow-up is required. These results support a narrow conclusion: GSE240016 contains subtype-associated LOX-family mouse age-direction estimates, including a candidate aged-lower mTEC1</w:t>
+        <w:t xml:space="preserve">in mTEC1 (-3.286; 2+2). The pattern was subtype-dependent rather than a uniform LOX-family response. Quality-control, leave-one-sample-out, matched sparse-gene, and annotation-confidence analyses preserved the focal directions where estimable, but they did not create independent biological replication. Interpretation remains limited by small biological-replicate counts, sparse detection, lower aged sequencing depth and detected-gene counts, biological-unit proxy labels, annotation uncertainty, and unresolved sample or batch confounding. Independent mouse datasets supplied supportive, opposite, weak/null, or mixed broad and related-subtype transcript context; none provided an exact capsFB, medFB, or mTEC1 comparison. GSE231906 contributed only within-expression-unit human detection context among uniquely joined barcodes because independent donor identity was not established; it was not used as human age-effect evidence. External evidence was therefore mixed and contextual. This hypothesis-generating study identifies subtype-associated LOX-family transcript directions in GSE240016, including a candidate aged-lower mTEC1</w:t>
       </w:r>
       <w:r>
         <w:t xml:space="preserve"> </w:t>
@@ -186,7 +176,7 @@
         <w:t xml:space="preserve"> </w:t>
       </w:r>
       <w:r>
-        <w:t xml:space="preserve">transcript pattern.</w:t>
+        <w:t xml:space="preserve">pattern, while requiring orthogonal experimental follow-up before protein, activity, matrix, functional, or cross-species interpretation.</w:t>
       </w:r>
     </w:p>
     <w:bookmarkEnd w:id="11"/>
@@ -375,7 +365,7 @@
         <w:pStyle w:val="BodyText"/>
       </w:pPr>
       <w:r>
-        <w:t xml:space="preserve">GSE231906 was used only after a Phase 0/6A integrity gate [20]. It contains 59 expression units and cell-level metadata, but the available person/sample identifiers did not establish high-confidence independent persons. A strict unit-scoped barcode join linked 387,762 of 590,533 expression barcodes uniquely. The expression representation was classified</w:t>
+        <w:t xml:space="preserve">GSE231906 was used only after a data-integrity assessment [20]. It contains 59 expression units and cell-level metadata, but the available person/sample identifiers did not establish high-confidence independent persons. A strict unit-scoped barcode join linked 387,762 of 590,533 expression barcodes uniquely. The expression representation was classified</w:t>
       </w:r>
       <w:r>
         <w:t xml:space="preserve"> </w:t>
@@ -395,7 +385,7 @@
         <w:pStyle w:val="BodyText"/>
       </w:pPr>
       <w:r>
-        <w:t xml:space="preserve">Earlier human developmental thymus datasets and public protein or spatial resources were retained as optional background or feasibility context when present in the repository. They were not used to upgrade any focal grade and were not treated as independent aging evidence. Dataset roles, checksums, availability, and clean-room staging status are recorded in the final dataset input manifest.</w:t>
+        <w:t xml:space="preserve">Earlier human developmental thymus datasets and public protein or spatial resources were retained as optional background or feasibility context when present in the repository. They were not used to upgrade any focal robustness category and were not treated as independent aging evidence. Dataset roles, checksums, availability, and clean-room staging status are recorded in the final dataset input manifest.</w:t>
       </w:r>
     </w:p>
     <w:bookmarkEnd w:id="13"/>
@@ -761,7 +751,7 @@
         <w:t xml:space="preserve">baseMean</w:t>
       </w:r>
       <w:r>
-        <w:t xml:space="preserve">, log2 fold change, standard error, Wald statistic, nominal P value, and Benjamini-Hochberg adjusted P value [21]. The four values frozen for this manuscript are the canonical v5.6 results, not the slightly different Phase 2 robustness-filter estimates. Phase 2 intentionally used accepted robustness filtering and reruns to test direction stability; those values are sensitivity estimates and do not replace the canonical focal values.</w:t>
+        <w:t xml:space="preserve">, log2 fold change, standard error, Wald statistic, nominal P value, and Benjamini-Hochberg adjusted P value [21]. The four values frozen for this manuscript are the canonical v5.6 results, not the slightly different internal robustness-filter estimates. The robustness analyses intentionally used accepted filtering and reruns to test direction stability; those values are sensitivity estimates and do not replace the canonical focal values.</w:t>
       </w:r>
     </w:p>
     <w:p>
@@ -829,7 +819,7 @@
         <w:t xml:space="preserve">Loxl4</w:t>
       </w:r>
       <w:r>
-        <w:t xml:space="preserve">. Multiple testing within the authoritative differential-expression results used the Benjamini-Hochberg procedure. Statistical significance in the small dataset was not treated as proof of a biological mechanism, and grades were assigned from the complete internal-evidence framework rather than from adjusted P values alone.</w:t>
+        <w:t xml:space="preserve">. Multiple testing within the authoritative differential-expression results used the Benjamini-Hochberg procedure. Statistical significance in the small dataset was not treated as proof of a biological mechanism, and robustness categories were assigned from the complete internal-evidence framework rather than from adjusted P values alone.</w:t>
       </w:r>
     </w:p>
     <w:bookmarkEnd w:id="15"/>
@@ -855,17 +845,17 @@
         <w:pStyle w:val="BodyText"/>
       </w:pPr>
       <w:r>
-        <w:t xml:space="preserve">Processed-expression summaries and raw-count CPM summaries were kept distinct. Per-cell tests and correlations inherited within-sample dependence and were therefore descriptive. They were retained from v5.6 as historical/supporting material where their lineage was known, but Phase 9 did not use them to create or strengthen a focal claim.</w:t>
+        <w:t xml:space="preserve">Processed-expression summaries and raw-count CPM summaries were kept distinct. Per-cell tests and correlations inherited within-sample dependence and were therefore descriptive. They were retained from v5.6 as historical/supporting material where their lineage was known, but the final computational consolidation did not use them to create or strengthen a focal claim.</w:t>
       </w:r>
     </w:p>
     <w:bookmarkEnd w:id="16"/>
-    <w:bookmarkStart w:id="17" w:name="phase-2-robustness-analysis"/>
+    <w:bookmarkStart w:id="17" w:name="internal-robustness-analyses"/>
     <w:p>
       <w:pPr>
         <w:pStyle w:val="Heading3"/>
       </w:pPr>
       <w:r>
-        <w:t xml:space="preserve">Phase 2 robustness analysis</w:t>
+        <w:t xml:space="preserve">Internal robustness analyses</w:t>
       </w:r>
     </w:p>
     <w:p>
@@ -873,7 +863,7 @@
         <w:pStyle w:val="FirstParagraph"/>
       </w:pPr>
       <w:r>
-        <w:t xml:space="preserve">Phase 2 evaluated the four focal directions within GSE240016 using accepted configurations only. A prespecified quality-control grid varied cell-level gene-count, total-count, and mitochondrial-fraction thresholds. Focal sample-subtype groups were reaggregated after filtering, and the sign of each eligible estimate was compared with the accepted direction. Raw-count and processed-object summaries were also compared to determine whether a direction depended on one expression representation.</w:t>
+        <w:t xml:space="preserve">The internal robustness analyses evaluated the four focal directions within GSE240016 using accepted configurations only. A prespecified quality-control grid varied cell-level gene-count, total-count, and mitochondrial-fraction thresholds. Focal sample-subtype groups were reaggregated after filtering, and the sign of each eligible estimate was compared with the accepted direction. Raw-count and processed-object summaries were also compared to determine whether a direction depended on one expression representation.</w:t>
       </w:r>
     </w:p>
     <w:p>
@@ -949,17 +939,17 @@
         <w:t xml:space="preserve">BLOCKED_RSCRIPT_UNAVAILABLE</w:t>
       </w:r>
       <w:r>
-        <w:t xml:space="preserve">. Phase 9 did not install an arbitrary R environment or add an alternative statistical result. The same-cohort robustness grid and leave-one-out checks were interpreted only as internal computational sensitivity.</w:t>
+        <w:t xml:space="preserve">. The final computational consolidation did not install an arbitrary R environment or add an alternative statistical result. The same-cohort robustness grid and leave-one-out checks were interpreted only as internal computational sensitivity.</w:t>
       </w:r>
     </w:p>
     <w:bookmarkEnd w:id="17"/>
-    <w:bookmarkStart w:id="18" w:name="phase-3-sparse-gene-null"/>
+    <w:bookmarkStart w:id="18" w:name="matched-sparse-gene-null-analysis"/>
     <w:p>
       <w:pPr>
         <w:pStyle w:val="Heading3"/>
       </w:pPr>
       <w:r>
-        <w:t xml:space="preserve">Phase 3 sparse-gene null</w:t>
+        <w:t xml:space="preserve">Matched sparse-gene null analysis</w:t>
       </w:r>
     </w:p>
     <w:p>
@@ -967,7 +957,7 @@
         <w:pStyle w:val="FirstParagraph"/>
       </w:pPr>
       <w:r>
-        <w:t xml:space="preserve">Phase 3 examined whether the mTEC1</w:t>
+        <w:t xml:space="preserve">The matched sparse-gene null analysis examined whether the mTEC1</w:t>
       </w:r>
       <w:r>
         <w:t xml:space="preserve"> </w:t>
@@ -1087,17 +1077,17 @@
         <w:t xml:space="preserve">UNUSUAL_SPARSE_GENE_SIGNAL</w:t>
       </w:r>
       <w:r>
-        <w:t xml:space="preserve">; internal grade C was not upgraded. The analysis did not remove the n=2+2, age-batch, annotation, or external-replication limitations.</w:t>
+        <w:t xml:space="preserve">; internal robustness category C was not upgraded. The analysis did not remove the n=2+2, age-batch, annotation, or external-replication limitations.</w:t>
       </w:r>
     </w:p>
     <w:bookmarkEnd w:id="18"/>
-    <w:bookmarkStart w:id="19" w:name="phase-4-annotation-confidence-audit"/>
+    <w:bookmarkStart w:id="19" w:name="annotation-confidence-analysis"/>
     <w:p>
       <w:pPr>
         <w:pStyle w:val="Heading3"/>
       </w:pPr>
       <w:r>
-        <w:t xml:space="preserve">Phase 4 annotation-confidence audit</w:t>
+        <w:t xml:space="preserve">Annotation-confidence analysis</w:t>
       </w:r>
     </w:p>
     <w:p>
@@ -1105,7 +1095,7 @@
         <w:pStyle w:val="FirstParagraph"/>
       </w:pPr>
       <w:r>
-        <w:t xml:space="preserve">Phase 4 assessed whether the focal signs depended on low-confidence cells within the published annotations. Marker sets were predefined for capsFB (</w:t>
+        <w:t xml:space="preserve">The annotation-confidence analysis assessed whether the focal signs depended on low-confidence cells within the published annotations. Marker sets were predefined for capsFB (</w:t>
       </w:r>
       <w:r>
         <w:rPr>
@@ -1333,7 +1323,7 @@
         <w:t xml:space="preserve">ROBUST_TO_ANNOTATION_FILTERING</w:t>
       </w:r>
       <w:r>
-        <w:t xml:space="preserve">, explicitly as same-cohort sensitivity with no grade upgrade.</w:t>
+        <w:t xml:space="preserve">, explicitly as same-cohort sensitivity with no robustness-category upgrade.</w:t>
       </w:r>
     </w:p>
     <w:bookmarkEnd w:id="19"/>
@@ -1351,7 +1341,7 @@
         <w:pStyle w:val="FirstParagraph"/>
       </w:pPr>
       <w:r>
-        <w:t xml:space="preserve">For GSE223049, accepted counts for sorted broad thymic fibroblast and epithelial samples were normalized by library size to CPM and transformed as log2(CPM+1). High-age minus low-age differences were calculated from sample-level values. Exact enumeration of the available age-label permutations avoided asymptotic assumptions in the small groups. The dataset’s broad sorting, older aged group, and lack of capsFB, medFB, and mTEC1 labels constrained all interpretations to compartment-level context.</w:t>
+        <w:t xml:space="preserve">For GSE223049, accepted counts for sorted broad thymic fibroblast and epithelial samples were normalized by library size to CPM and transformed as log2(CPM+1). High-age minus low-age differences were calculated from sample-level values. Exact enumeration of the available age-label permutations avoided asymptotic assumptions in the small groups. The dataset's broad sorting, older aged group, and lack of capsFB, medFB, and mTEC1 labels constrained all interpretations to compartment-level context.</w:t>
       </w:r>
     </w:p>
     <w:p>
@@ -1385,7 +1375,7 @@
         <w:pStyle w:val="FirstParagraph"/>
       </w:pPr>
       <w:r>
-        <w:t xml:space="preserve">Phase 0/6A first inventoried GSE231906 archives, metadata, and expression units and computed checksums for available inputs. The accepted join was strict and unit-scoped: an expression barcode was linked only within its originating expression unit, duplicate metadata keys were not silently resolved across units, and ambiguous keys were excluded. Of 590,533 expression barcodes across 59 units, 387,762 joined uniquely.</w:t>
+        <w:t xml:space="preserve">The GSE231906 data-integrity assessment first inventoried archives, metadata, and expression units and computed checksums for available inputs. The accepted join was strict and unit-scoped: an expression barcode was linked only within its originating expression unit, duplicate metadata keys were not silently resolved across units, and ambiguous keys were excluded. Of 590,533 expression barcodes across 59 units, 387,762 joined uniquely.</w:t>
       </w:r>
     </w:p>
     <w:p>
@@ -1443,7 +1433,7 @@
         <w:pStyle w:val="FirstParagraph"/>
       </w:pPr>
       <w:r>
-        <w:t xml:space="preserve">Phase 7 converted the accepted outputs into 23 evidence atoms linked to four focal claims. Each atom recorded dataset, population, endpoint, direction, exactness, analytical role, limitations, and an independence group. The 23 atoms collapsed into five biological evidence families after dependencies were made explicit. Same-cohort QC, reaggregation, sparse-null, and annotation audits were not counted as new biological cohorts.</w:t>
+        <w:t xml:space="preserve">The cross-dataset evidence synthesis converted the accepted outputs into 23 evidence atoms linked to four focal claims. Each atom recorded dataset, population, endpoint, direction, exactness, analytical role, limitations, and an independence group. The 23 atoms collapsed into five biological evidence families after dependencies were made explicit. Same-cohort QC, reaggregation, sparse-null, and annotation audits were not counted as new biological cohorts.</w:t>
       </w:r>
     </w:p>
     <w:p>
@@ -1459,19 +1449,7 @@
         <w:pStyle w:val="BodyText"/>
       </w:pPr>
       <w:r>
-        <w:t xml:space="preserve">The four internal grades were frozen as</w:t>
-      </w:r>
-      <w:r>
-        <w:t xml:space="preserve"> </w:t>
-      </w:r>
-      <w:r>
-        <w:rPr>
-          <w:rStyle w:val="VerbatimChar"/>
-        </w:rPr>
-        <w:t xml:space="preserve">INTERNAL_COMPUTATIONAL_ROBUSTNESS_ONLY</w:t>
-      </w:r>
-      <w:r>
-        <w:t xml:space="preserve">. They summarize accepted same-cohort behavior and known limitations; they are not evidence-strength grades across species or datasets.</w:t>
+        <w:t xml:space="preserve">The frozen A, B+, B, and C labels are internal computational robustness categories. They summarize accepted same-cohort behavior and known limitations; they are not a universal evidence-grading framework and do not grade evidence strength across species or datasets.</w:t>
       </w:r>
     </w:p>
     <w:bookmarkEnd w:id="22"/>
@@ -1489,7 +1467,7 @@
         <w:pStyle w:val="FirstParagraph"/>
       </w:pPr>
       <w:r>
-        <w:t xml:space="preserve">Phase 1 constructed isolated execution roots containing tracked files from the accepted base commit, explicit input manifests, separate output roots, and separate cache and temporary roots. Inputs were classified as direct computational, explicit synthesis, audit inventory, historical non-authoritative, optional context, or missing scope expansion. Checksums were required for available computational inputs, and inventory-only files were not misclassified as missing computational inputs.</w:t>
+        <w:t xml:space="preserve">The reproducibility audit constructed isolated execution roots containing tracked files from the accepted base commit, explicit input manifests, separate output roots, and separate cache and temporary roots. Inputs were classified as direct computational, explicit synthesis, audit inventory, historical non-authoritative, optional context, or missing scope expansion. Checksums were required for available computational inputs, and inventory-only files were not misclassified as missing computational inputs.</w:t>
       </w:r>
     </w:p>
     <w:p>
@@ -1505,7 +1483,37 @@
         <w:pStyle w:val="BodyText"/>
       </w:pPr>
       <w:r>
-        <w:t xml:space="preserve">Outputs were assigned byte-identical, numerically identical, semantically equivalent, blocked, failed, or not-applicable policies before comparison. Numerical comparisons used predetermined absolute and relative tolerances no wider than 1e-8 unless specifically justified, with key alignment, ordering, NaN, and formatting rules recorded in the audit. Two independent FULL_LOCAL runs and two independent RELEASE_DERIVED runs used empty output, cache, and temporary directories. No cross-run reads, hidden-state dependence, or numeric invariant failure was found. Rscript/Bioconductor unavailability was recorded independently and did not invalidate the Python CORE result.</w:t>
+        <w:t xml:space="preserve">Outputs were assigned byte-identical, numerically identical, semantically equivalent, blocked, failed, or not-applicable policies before comparison. Numerical comparisons used predetermined absolute and relative tolerances no wider than 1e-8 unless specifically justified, with key alignment, ordering, NaN, and formatting rules recorded in the audit. Two isolated</w:t>
+      </w:r>
+      <w:r>
+        <w:t xml:space="preserve"> </w:t>
+      </w:r>
+      <w:r>
+        <w:rPr>
+          <w:rStyle w:val="VerbatimChar"/>
+        </w:rPr>
+        <w:t xml:space="preserve">FULL_LOCAL</w:t>
+      </w:r>
+      <w:r>
+        <w:t xml:space="preserve"> </w:t>
+      </w:r>
+      <w:r>
+        <w:t xml:space="preserve">attempts reproduced the available Python core but remained partial because specified external inputs and the R/Bioconductor environment were unavailable.</w:t>
+      </w:r>
+      <w:r>
+        <w:t xml:space="preserve"> </w:t>
+      </w:r>
+      <w:r>
+        <w:rPr>
+          <w:rStyle w:val="VerbatimChar"/>
+        </w:rPr>
+        <w:t xml:space="preserve">RELEASE_DERIVED</w:t>
+      </w:r>
+      <w:r>
+        <w:t xml:space="preserve"> </w:t>
+      </w:r>
+      <w:r>
+        <w:t xml:space="preserve">checks completed without numerical invariant failures. The release therefore does not claim complete clean-room reproduction of every historical workflow.</w:t>
       </w:r>
     </w:p>
     <w:bookmarkEnd w:id="23"/>
@@ -1523,7 +1531,7 @@
         <w:pStyle w:val="FirstParagraph"/>
       </w:pPr>
       <w:r>
-        <w:t xml:space="preserve">Phase 8 translated the frozen evidence and uncertainty records into an experimental-planning framework. Candidate-assay pairs received component scores for internal robustness, expected information gain, feasibility, interpretability, and risk. Three scenarios—evidence-first, information-gain-first, and practical-first—used predefined weights. Sensitivity analysis assessed how scenario ranks changed within the accepted weight definitions.</w:t>
+        <w:t xml:space="preserve">The experimental prioritization framework translated the frozen evidence and uncertainty records into an experimental-planning framework. Candidate-assay pairs received component scores for internal robustness, expected information gain, feasibility, interpretability, and risk. Three scenarios—evidence-first, information-gain-first, and practical-first—used predefined weights. Sensitivity analysis assessed how scenario ranks changed within the accepted weight definitions.</w:t>
       </w:r>
     </w:p>
     <w:p>
@@ -1531,12 +1539,12 @@
         <w:pStyle w:val="BodyText"/>
       </w:pPr>
       <w:r>
-        <w:t xml:space="preserve">The resulting scores are decision aids, not biological observations. They do not change a focal grade, add an evidence atom, establish a reagent, or imply that a higher-ranked candidate is more biologically important. Reagent availability and specificity require manual verification before any experiment.</w:t>
+        <w:t xml:space="preserve">The resulting scores are decision aids, not biological observations. They do not change a focal robustness category, add an evidence atom, establish a reagent, or imply that a higher-ranked candidate is more biologically important. Reagent availability and specificity require manual verification before any experiment.</w:t>
       </w:r>
     </w:p>
     <w:bookmarkEnd w:id="24"/>
     <w:bookmarkEnd w:id="25"/>
-    <w:bookmarkStart w:id="34" w:name="results"/>
+    <w:bookmarkStart w:id="43" w:name="results"/>
     <w:p>
       <w:pPr>
         <w:pStyle w:val="Heading2"/>
@@ -1545,7 +1553,7 @@
         <w:t xml:space="preserve">Results</w:t>
       </w:r>
     </w:p>
-    <w:bookmarkStart w:id="26" w:name="Xf527bb2d0f3cce3ce8524ce0d6d1e6af06146e1"/>
+    <w:bookmarkStart w:id="29" w:name="Xf527bb2d0f3cce3ce8524ce0d6d1e6af06146e1"/>
     <w:p>
       <w:pPr>
         <w:pStyle w:val="Heading3"/>
@@ -1559,7 +1567,7 @@
         <w:pStyle w:val="FirstParagraph"/>
       </w:pPr>
       <w:r>
-        <w:t xml:space="preserve">The final focal matrix retained four GSE240016 aged-versus-young estimates (Table 1). capsFB</w:t>
+        <w:t xml:space="preserve">The final focal matrix retained four GSE240016 aged-versus-young estimates (Table 1; Figure 1). capsFB</w:t>
       </w:r>
       <w:r>
         <w:t xml:space="preserve"> </w:t>
@@ -1574,7 +1582,7 @@
         <w:t xml:space="preserve"> </w:t>
       </w:r>
       <w:r>
-        <w:t xml:space="preserve">was lower in aged samples (log2 fold change -1.456; 3+3 sample labels; grade A). medFB</w:t>
+        <w:t xml:space="preserve">was lower in aged samples (log2 fold change -1.456; 3+3 sample labels; category A). medFB</w:t>
       </w:r>
       <w:r>
         <w:t xml:space="preserve"> </w:t>
@@ -1637,23 +1645,27 @@
     <w:tbl>
       <w:tblPr>
         <w:tblStyle w:val="Table"/>
-        <w:tblW w:type="pct" w:w="5000"/>
-        <w:tblLayout w:type="fixed"/>
+        <w:tblW w:type="auto" w:w="0"/>
+        <w:tblLayout w:type="autofit"/>
         <w:tblLook w:firstRow="1" w:lastRow="0" w:firstColumn="0" w:lastColumn="0" w:noHBand="0" w:noVBand="0" w:val="0020"/>
       </w:tblPr>
       <w:tblGrid>
-        <w:gridCol w:w="1320"/>
-        <w:gridCol w:w="1760"/>
-        <w:gridCol w:w="1760"/>
-        <w:gridCol w:w="1760"/>
-        <w:gridCol w:w="1320"/>
+        <w:gridCol w:w="1584"/>
+        <w:gridCol w:w="1584"/>
+        <w:gridCol w:w="1584"/>
+        <w:gridCol w:w="1584"/>
+        <w:gridCol w:w="1584"/>
       </w:tblGrid>
       <w:tr>
         <w:trPr>
           <w:tblHeader w:val="on"/>
+          <w:tblHeader w:val="true"/>
+          <w:cantSplit/>
         </w:trPr>
         <w:tc>
-          <w:tcPr/>
+          <w:tcPr>
+            <w:vAlign w:val="top"/>
+          </w:tcPr>
           <w:p>
             <w:pPr>
               <w:pStyle w:val="Compact"/>
@@ -1664,7 +1676,9 @@
           </w:p>
         </w:tc>
         <w:tc>
-          <w:tcPr/>
+          <w:tcPr>
+            <w:vAlign w:val="top"/>
+          </w:tcPr>
           <w:p>
             <w:pPr>
               <w:pStyle w:val="Compact"/>
@@ -1676,7 +1690,9 @@
           </w:p>
         </w:tc>
         <w:tc>
-          <w:tcPr/>
+          <w:tcPr>
+            <w:vAlign w:val="top"/>
+          </w:tcPr>
           <w:p>
             <w:pPr>
               <w:pStyle w:val="Compact"/>
@@ -1688,19 +1704,23 @@
           </w:p>
         </w:tc>
         <w:tc>
-          <w:tcPr/>
+          <w:tcPr>
+            <w:vAlign w:val="top"/>
+          </w:tcPr>
           <w:p>
             <w:pPr>
               <w:pStyle w:val="Compact"/>
               <w:jc w:val="right"/>
             </w:pPr>
             <w:r>
-              <w:t xml:space="preserve">Internal grade</w:t>
-            </w:r>
-          </w:p>
-        </w:tc>
-        <w:tc>
-          <w:tcPr/>
+              <w:t xml:space="preserve">Internal robustness</w:t>
+            </w:r>
+          </w:p>
+        </w:tc>
+        <w:tc>
+          <w:tcPr>
+            <w:vAlign w:val="top"/>
+          </w:tcPr>
           <w:p>
             <w:pPr>
               <w:pStyle w:val="Compact"/>
@@ -1712,8 +1732,13 @@
         </w:tc>
       </w:tr>
       <w:tr>
-        <w:tc>
-          <w:tcPr/>
+        <w:trPr>
+          <w:cantSplit/>
+        </w:trPr>
+        <w:tc>
+          <w:tcPr>
+            <w:vAlign w:val="top"/>
+          </w:tcPr>
           <w:p>
             <w:pPr>
               <w:pStyle w:val="Compact"/>
@@ -1733,7 +1758,9 @@
           </w:p>
         </w:tc>
         <w:tc>
-          <w:tcPr/>
+          <w:tcPr>
+            <w:vAlign w:val="top"/>
+          </w:tcPr>
           <w:p>
             <w:pPr>
               <w:pStyle w:val="Compact"/>
@@ -1745,7 +1772,9 @@
           </w:p>
         </w:tc>
         <w:tc>
-          <w:tcPr/>
+          <w:tcPr>
+            <w:vAlign w:val="top"/>
+          </w:tcPr>
           <w:p>
             <w:pPr>
               <w:pStyle w:val="Compact"/>
@@ -1757,7 +1786,9 @@
           </w:p>
         </w:tc>
         <w:tc>
-          <w:tcPr/>
+          <w:tcPr>
+            <w:vAlign w:val="top"/>
+          </w:tcPr>
           <w:p>
             <w:pPr>
               <w:pStyle w:val="Compact"/>
@@ -1769,7 +1800,9 @@
           </w:p>
         </w:tc>
         <w:tc>
-          <w:tcPr/>
+          <w:tcPr>
+            <w:vAlign w:val="top"/>
+          </w:tcPr>
           <w:p>
             <w:pPr>
               <w:pStyle w:val="Compact"/>
@@ -1781,8 +1814,13 @@
         </w:tc>
       </w:tr>
       <w:tr>
-        <w:tc>
-          <w:tcPr/>
+        <w:trPr>
+          <w:cantSplit/>
+        </w:trPr>
+        <w:tc>
+          <w:tcPr>
+            <w:vAlign w:val="top"/>
+          </w:tcPr>
           <w:p>
             <w:pPr>
               <w:pStyle w:val="Compact"/>
@@ -1802,7 +1840,9 @@
           </w:p>
         </w:tc>
         <w:tc>
-          <w:tcPr/>
+          <w:tcPr>
+            <w:vAlign w:val="top"/>
+          </w:tcPr>
           <w:p>
             <w:pPr>
               <w:pStyle w:val="Compact"/>
@@ -1814,7 +1854,9 @@
           </w:p>
         </w:tc>
         <w:tc>
-          <w:tcPr/>
+          <w:tcPr>
+            <w:vAlign w:val="top"/>
+          </w:tcPr>
           <w:p>
             <w:pPr>
               <w:pStyle w:val="Compact"/>
@@ -1826,7 +1868,9 @@
           </w:p>
         </w:tc>
         <w:tc>
-          <w:tcPr/>
+          <w:tcPr>
+            <w:vAlign w:val="top"/>
+          </w:tcPr>
           <w:p>
             <w:pPr>
               <w:pStyle w:val="Compact"/>
@@ -1838,7 +1882,9 @@
           </w:p>
         </w:tc>
         <w:tc>
-          <w:tcPr/>
+          <w:tcPr>
+            <w:vAlign w:val="top"/>
+          </w:tcPr>
           <w:p>
             <w:pPr>
               <w:pStyle w:val="Compact"/>
@@ -1850,8 +1896,13 @@
         </w:tc>
       </w:tr>
       <w:tr>
-        <w:tc>
-          <w:tcPr/>
+        <w:trPr>
+          <w:cantSplit/>
+        </w:trPr>
+        <w:tc>
+          <w:tcPr>
+            <w:vAlign w:val="top"/>
+          </w:tcPr>
           <w:p>
             <w:pPr>
               <w:pStyle w:val="Compact"/>
@@ -1871,7 +1922,9 @@
           </w:p>
         </w:tc>
         <w:tc>
-          <w:tcPr/>
+          <w:tcPr>
+            <w:vAlign w:val="top"/>
+          </w:tcPr>
           <w:p>
             <w:pPr>
               <w:pStyle w:val="Compact"/>
@@ -1883,7 +1936,9 @@
           </w:p>
         </w:tc>
         <w:tc>
-          <w:tcPr/>
+          <w:tcPr>
+            <w:vAlign w:val="top"/>
+          </w:tcPr>
           <w:p>
             <w:pPr>
               <w:pStyle w:val="Compact"/>
@@ -1895,7 +1950,9 @@
           </w:p>
         </w:tc>
         <w:tc>
-          <w:tcPr/>
+          <w:tcPr>
+            <w:vAlign w:val="top"/>
+          </w:tcPr>
           <w:p>
             <w:pPr>
               <w:pStyle w:val="Compact"/>
@@ -1907,7 +1964,9 @@
           </w:p>
         </w:tc>
         <w:tc>
-          <w:tcPr/>
+          <w:tcPr>
+            <w:vAlign w:val="top"/>
+          </w:tcPr>
           <w:p>
             <w:pPr>
               <w:pStyle w:val="Compact"/>
@@ -1919,8 +1978,13 @@
         </w:tc>
       </w:tr>
       <w:tr>
-        <w:tc>
-          <w:tcPr/>
+        <w:trPr>
+          <w:cantSplit/>
+        </w:trPr>
+        <w:tc>
+          <w:tcPr>
+            <w:vAlign w:val="top"/>
+          </w:tcPr>
           <w:p>
             <w:pPr>
               <w:pStyle w:val="Compact"/>
@@ -1940,7 +2004,9 @@
           </w:p>
         </w:tc>
         <w:tc>
-          <w:tcPr/>
+          <w:tcPr>
+            <w:vAlign w:val="top"/>
+          </w:tcPr>
           <w:p>
             <w:pPr>
               <w:pStyle w:val="Compact"/>
@@ -1952,7 +2018,9 @@
           </w:p>
         </w:tc>
         <w:tc>
-          <w:tcPr/>
+          <w:tcPr>
+            <w:vAlign w:val="top"/>
+          </w:tcPr>
           <w:p>
             <w:pPr>
               <w:pStyle w:val="Compact"/>
@@ -1964,7 +2032,9 @@
           </w:p>
         </w:tc>
         <w:tc>
-          <w:tcPr/>
+          <w:tcPr>
+            <w:vAlign w:val="top"/>
+          </w:tcPr>
           <w:p>
             <w:pPr>
               <w:pStyle w:val="Compact"/>
@@ -1976,7 +2046,9 @@
           </w:p>
         </w:tc>
         <w:tc>
-          <w:tcPr/>
+          <w:tcPr>
+            <w:vAlign w:val="top"/>
+          </w:tcPr>
           <w:p>
             <w:pPr>
               <w:pStyle w:val="Compact"/>
@@ -1993,19 +2065,7 @@
         <w:pStyle w:val="BodyText"/>
       </w:pPr>
       <w:r>
-        <w:t xml:space="preserve">Every grade in Table 1 means</w:t>
-      </w:r>
-      <w:r>
-        <w:t xml:space="preserve"> </w:t>
-      </w:r>
-      <w:r>
-        <w:rPr>
-          <w:rStyle w:val="VerbatimChar"/>
-        </w:rPr>
-        <w:t xml:space="preserve">INTERNAL_COMPUTATIONAL_ROBUSTNESS_ONLY</w:t>
-      </w:r>
-      <w:r>
-        <w:t xml:space="preserve">. Grade A for capsFB</w:t>
+        <w:t xml:space="preserve">The Table 1 labels are internal computational robustness categories, defined once for this study rather than as a universal evidence-grading framework. Category A for capsFB</w:t>
       </w:r>
       <w:r>
         <w:t xml:space="preserve"> </w:t>
@@ -2020,7 +2080,7 @@
         <w:t xml:space="preserve"> </w:t>
       </w:r>
       <w:r>
-        <w:t xml:space="preserve">does not mean external evidence is stronger than for the other candidates; it means that the accepted internal checks were more complete and less fragile. Grade C for mTEC1</w:t>
+        <w:t xml:space="preserve">does not mean external evidence is stronger than for the other candidates; it means that the accepted internal checks were more complete and less fragile. Category C for mTEC1</w:t>
       </w:r>
       <w:r>
         <w:t xml:space="preserve"> </w:t>
@@ -2076,14 +2136,79 @@
         <w:t xml:space="preserve">in aged samples. These results are transcript associations within published labels. They do not establish a shared enzymatic program or a compartment-wide matrix phenotype.</w:t>
       </w:r>
     </w:p>
-    <w:bookmarkEnd w:id="26"/>
-    <w:bookmarkStart w:id="27" w:name="phase-2-internal-robustness"/>
+    <w:p>
+      <w:pPr>
+        <w:pStyle w:val="BodyText"/>
+      </w:pPr>
+      <w:r>
+        <w:drawing>
+          <wp:inline>
+            <wp:extent cx="5334000" cy="3222624"/>
+            <wp:effectExtent b="0" l="0" r="0" t="0"/>
+            <wp:docPr descr="Figure 1. Four focal GSE240016 estimates." title="" id="27" name="Picture"/>
+            <a:graphic>
+              <a:graphicData uri="http://schemas.openxmlformats.org/drawingml/2006/picture">
+                <pic:pic>
+                  <pic:nvPicPr>
+                    <pic:cNvPr descr="../results/figures/v6_final/figure_1_focal_effects.png" id="28" name="Picture"/>
+                    <pic:cNvPicPr>
+                      <a:picLocks noChangeArrowheads="1" noChangeAspect="1"/>
+                    </pic:cNvPicPr>
+                  </pic:nvPicPr>
+                  <pic:blipFill>
+                    <a:blip r:embed="rId26"/>
+                    <a:stretch>
+                      <a:fillRect/>
+                    </a:stretch>
+                  </pic:blipFill>
+                  <pic:spPr bwMode="auto">
+                    <a:xfrm>
+                      <a:off x="0" y="0"/>
+                      <a:ext cx="5334000" cy="3222624"/>
+                    </a:xfrm>
+                    <a:prstGeom prst="rect">
+                      <a:avLst/>
+                    </a:prstGeom>
+                    <a:noFill/>
+                    <a:ln w="9525">
+                      <a:noFill/>
+                      <a:headEnd/>
+                      <a:tailEnd/>
+                    </a:ln>
+                  </pic:spPr>
+                </pic:pic>
+              </a:graphicData>
+            </a:graphic>
+          </wp:inline>
+        </w:drawing>
+      </w:r>
+    </w:p>
+    <w:p>
+      <w:pPr>
+        <w:pStyle w:val="BodyText"/>
+      </w:pPr>
+      <w:r>
+        <w:rPr>
+          <w:b/>
+          <w:bCs/>
+        </w:rPr>
+        <w:t xml:space="preserve">Figure 1. Four focal GSE240016 transcript estimates.</w:t>
+      </w:r>
+      <w:r>
+        <w:t xml:space="preserve"> </w:t>
+      </w:r>
+      <w:r>
+        <w:t xml:space="preserve">The source dataset is GSE240016, and the analytical unit is the subtype-by-sample pseudobulk using repository sample labels as biological-unit proxies. The displayed aged-versus-young log2 fold-change estimates are inferential outputs; no confidence intervals were fabricated because none was available in the frozen focal table. Internal computational robustness categories are shown for orientation. Interpretation is limited by small sample counts, proxy biological-unit labels, and unresolved age-batch structure.</w:t>
+      </w:r>
+    </w:p>
+    <w:bookmarkEnd w:id="29"/>
+    <w:bookmarkStart w:id="30" w:name="internal-robustness"/>
     <w:p>
       <w:pPr>
         <w:pStyle w:val="Heading3"/>
       </w:pPr>
       <w:r>
-        <w:t xml:space="preserve">Phase 2 internal robustness</w:t>
+        <w:t xml:space="preserve">Internal robustness</w:t>
       </w:r>
     </w:p>
     <w:p>
@@ -2091,7 +2216,7 @@
         <w:pStyle w:val="FirstParagraph"/>
       </w:pPr>
       <w:r>
-        <w:t xml:space="preserve">The Phase 2 quality-control grid retained the focal signs across all accepted, estimable configurations. Raw-count CPM and processed-object descriptive representations also retained the directions, although effect magnitudes differed as expected between representations and filtering rules. This distinction is why the v5.6 canonical values remain the headline estimates and the Phase 2 estimates remain sensitivity outputs.</w:t>
+        <w:t xml:space="preserve">The quality-control grid retained the focal signs across all accepted, estimable configurations. Raw-count CPM and processed-object descriptive representations also retained the directions, although effect magnitudes differed as expected between representations and filtering rules. This distinction is why the v5.6 canonical values remain the headline estimates and the internal robustness estimates remain sensitivity outputs.</w:t>
       </w:r>
     </w:p>
     <w:p>
@@ -2179,11 +2304,11 @@
         <w:t xml:space="preserve">UNKNOWN</w:t>
       </w:r>
       <w:r>
-        <w:t xml:space="preserve">, and sample labels remain biological-unit proxies. Cross-method checking with edgeR/limma remains blocked by unavailable Rscript/Bioconductor. The accepted grades incorporate these unresolved conditions.</w:t>
-      </w:r>
-    </w:p>
-    <w:bookmarkEnd w:id="27"/>
-    <w:bookmarkStart w:id="28" w:name="mtec1-loxl2-sparse-gene-assessment"/>
+        <w:t xml:space="preserve">, and sample labels remain biological-unit proxies. Cross-method checking with edgeR/limma remains blocked by unavailable Rscript/Bioconductor. The accepted robustness categories incorporate these unresolved conditions.</w:t>
+      </w:r>
+    </w:p>
+    <w:bookmarkEnd w:id="30"/>
+    <w:bookmarkStart w:id="34" w:name="mtec1-loxl2-sparse-gene-assessment"/>
     <w:p>
       <w:pPr>
         <w:pStyle w:val="Heading3"/>
@@ -2197,7 +2322,7 @@
         <w:pStyle w:val="FirstParagraph"/>
       </w:pPr>
       <w:r>
-        <w:t xml:space="preserve">The Phase 3 primary matched pool contained 200 genes chosen without age-effect leakage. The</w:t>
+        <w:t xml:space="preserve">The primary matched pool contained 200 genes chosen without age-effect leakage. The</w:t>
       </w:r>
       <w:r>
         <w:t xml:space="preserve"> </w:t>
@@ -2261,7 +2386,7 @@
         <w:pStyle w:val="BodyText"/>
       </w:pPr>
       <w:r>
-        <w:t xml:space="preserve">The final Phase 3 verdict was</w:t>
+        <w:t xml:space="preserve">The final matched sparse-gene assessment was</w:t>
       </w:r>
       <w:r>
         <w:t xml:space="preserve"> </w:t>
@@ -2273,11 +2398,105 @@
         <w:t xml:space="preserve">UNUSUAL_SPARSE_GENE_SIGNAL</w:t>
       </w:r>
       <w:r>
-        <w:t xml:space="preserve">. The result remained grade C. The combination of a large pseudobulk estimate, ordered sample summaries, low aged detection, and an unusual matched-null position makes the observation useful for a discriminating follow-up assay, but its 2+2 design and sparse expression make it high risk.</w:t>
-      </w:r>
-    </w:p>
-    <w:bookmarkEnd w:id="28"/>
-    <w:bookmarkStart w:id="29" w:name="annotation-confidence-robustness"/>
+        <w:t xml:space="preserve">. The result remained category C. The combination of a large pseudobulk estimate, ordered sample summaries, low aged detection, and an unusual matched-null position makes the observation useful for a discriminating follow-up assay, but its 2+2 design and sparse expression make it high risk (Figure 2).</w:t>
+      </w:r>
+    </w:p>
+    <w:p>
+      <w:pPr>
+        <w:pStyle w:val="BodyText"/>
+      </w:pPr>
+      <w:r>
+        <w:drawing>
+          <wp:inline>
+            <wp:extent cx="5334000" cy="3385038"/>
+            <wp:effectExtent b="0" l="0" r="0" t="0"/>
+            <wp:docPr descr="Figure 2. mTEC1 Loxl2 sample-level architecture." title="" id="32" name="Picture"/>
+            <a:graphic>
+              <a:graphicData uri="http://schemas.openxmlformats.org/drawingml/2006/picture">
+                <pic:pic>
+                  <pic:nvPicPr>
+                    <pic:cNvPr descr="../results/figures/v6_final/figure_2_mtec1_loxl2_sample_context.png" id="33" name="Picture"/>
+                    <pic:cNvPicPr>
+                      <a:picLocks noChangeArrowheads="1" noChangeAspect="1"/>
+                    </pic:cNvPicPr>
+                  </pic:nvPicPr>
+                  <pic:blipFill>
+                    <a:blip r:embed="rId31"/>
+                    <a:stretch>
+                      <a:fillRect/>
+                    </a:stretch>
+                  </pic:blipFill>
+                  <pic:spPr bwMode="auto">
+                    <a:xfrm>
+                      <a:off x="0" y="0"/>
+                      <a:ext cx="5334000" cy="3385038"/>
+                    </a:xfrm>
+                    <a:prstGeom prst="rect">
+                      <a:avLst/>
+                    </a:prstGeom>
+                    <a:noFill/>
+                    <a:ln w="9525">
+                      <a:noFill/>
+                      <a:headEnd/>
+                      <a:tailEnd/>
+                    </a:ln>
+                  </pic:spPr>
+                </pic:pic>
+              </a:graphicData>
+            </a:graphic>
+          </wp:inline>
+        </w:drawing>
+      </w:r>
+    </w:p>
+    <w:p>
+      <w:pPr>
+        <w:pStyle w:val="BodyText"/>
+      </w:pPr>
+      <w:r>
+        <w:rPr>
+          <w:b/>
+          <w:bCs/>
+        </w:rPr>
+        <w:t xml:space="preserve">Figure 2. mTEC1</w:t>
+      </w:r>
+      <w:r>
+        <w:rPr>
+          <w:b/>
+          <w:bCs/>
+        </w:rPr>
+        <w:t xml:space="preserve"> </w:t>
+      </w:r>
+      <w:r>
+        <w:rPr>
+          <w:rStyle w:val="VerbatimChar"/>
+          <w:b/>
+          <w:bCs/>
+        </w:rPr>
+        <w:t xml:space="preserve">Loxl2</w:t>
+      </w:r>
+      <w:r>
+        <w:rPr>
+          <w:b/>
+          <w:bCs/>
+        </w:rPr>
+        <w:t xml:space="preserve"> </w:t>
+      </w:r>
+      <w:r>
+        <w:rPr>
+          <w:b/>
+          <w:bCs/>
+        </w:rPr>
+        <w:t xml:space="preserve">sample-level architecture.</w:t>
+      </w:r>
+      <w:r>
+        <w:t xml:space="preserve"> </w:t>
+      </w:r>
+      <w:r>
+        <w:t xml:space="preserve">The source dataset is GSE240016, and the analytical units shown are the four included repository sample labels used as biological-unit proxies: two young and two aged. Detection fraction and log2(CPM+1) are descriptive sample-level summaries; cells are not treated as independent replicates, and no inferential P value is shown. Lower aged sequencing depth and detection, sparse expression, the proxy status of the sample labels, and residual batch uncertainty remain unresolved.</w:t>
+      </w:r>
+    </w:p>
+    <w:bookmarkEnd w:id="34"/>
+    <w:bookmarkStart w:id="35" w:name="annotation-confidence-robustness"/>
     <w:p>
       <w:pPr>
         <w:pStyle w:val="Heading3"/>
@@ -2291,7 +2510,7 @@
         <w:pStyle w:val="FirstParagraph"/>
       </w:pPr>
       <w:r>
-        <w:t xml:space="preserve">All four focal signs were preserved across every valid annotation-confidence tier. The high-confidence-non-doublet filter retained 98.2% of published capsFB cells, 91.5% of medFB cells, and 98.2% of mTEC1 cells, while preserving all focal libraries. The corresponding Phase 4 verdict for each focal comparison was</w:t>
+        <w:t xml:space="preserve">All four focal signs were preserved across every valid annotation-confidence tier. The high-confidence-non-doublet filter retained 98.2% of published capsFB cells, 91.5% of medFB cells, and 98.2% of mTEC1 cells, while preserving all focal libraries. The corresponding annotation-confidence assessment for each focal comparison was</w:t>
       </w:r>
       <w:r>
         <w:t xml:space="preserve"> </w:t>
@@ -2337,8 +2556,8 @@
         <w:t xml:space="preserve">remained sparse across tiers and did not supply additional independent replication. Leave-one-marker-out analyses showed that the focal directions were not tied to a single marker in the accepted set. Independent reference mapping remained blocked, so annotation robustness was not upgraded to annotation corroboration.</w:t>
       </w:r>
     </w:p>
-    <w:bookmarkEnd w:id="29"/>
-    <w:bookmarkStart w:id="30" w:name="X73eb70207cd6ebb154b3c9ee2f412952ba44101"/>
+    <w:bookmarkEnd w:id="35"/>
+    <w:bookmarkStart w:id="39" w:name="X73eb70207cd6ebb154b3c9ee2f412952ba44101"/>
     <w:p>
       <w:pPr>
         <w:pStyle w:val="Heading3"/>
@@ -2491,23 +2710,27 @@
     <w:tbl>
       <w:tblPr>
         <w:tblStyle w:val="Table"/>
-        <w:tblW w:type="pct" w:w="5000"/>
-        <w:tblLayout w:type="fixed"/>
+        <w:tblW w:type="auto" w:w="0"/>
+        <w:tblLayout w:type="autofit"/>
         <w:tblLook w:firstRow="1" w:lastRow="0" w:firstColumn="0" w:lastColumn="0" w:noHBand="0" w:noVBand="0" w:val="0020"/>
       </w:tblPr>
       <w:tblGrid>
-        <w:gridCol w:w="1485"/>
-        <w:gridCol w:w="1485"/>
-        <w:gridCol w:w="1485"/>
-        <w:gridCol w:w="1980"/>
-        <w:gridCol w:w="1485"/>
+        <w:gridCol w:w="1584"/>
+        <w:gridCol w:w="1584"/>
+        <w:gridCol w:w="1584"/>
+        <w:gridCol w:w="1584"/>
+        <w:gridCol w:w="1584"/>
       </w:tblGrid>
       <w:tr>
         <w:trPr>
           <w:tblHeader w:val="on"/>
+          <w:tblHeader w:val="true"/>
+          <w:cantSplit/>
         </w:trPr>
         <w:tc>
-          <w:tcPr/>
+          <w:tcPr>
+            <w:vAlign w:val="top"/>
+          </w:tcPr>
           <w:p>
             <w:pPr>
               <w:pStyle w:val="Compact"/>
@@ -2518,7 +2741,9 @@
           </w:p>
         </w:tc>
         <w:tc>
-          <w:tcPr/>
+          <w:tcPr>
+            <w:vAlign w:val="top"/>
+          </w:tcPr>
           <w:p>
             <w:pPr>
               <w:pStyle w:val="Compact"/>
@@ -2529,7 +2754,9 @@
           </w:p>
         </w:tc>
         <w:tc>
-          <w:tcPr/>
+          <w:tcPr>
+            <w:vAlign w:val="top"/>
+          </w:tcPr>
           <w:p>
             <w:pPr>
               <w:pStyle w:val="Compact"/>
@@ -2540,7 +2767,9 @@
           </w:p>
         </w:tc>
         <w:tc>
-          <w:tcPr/>
+          <w:tcPr>
+            <w:vAlign w:val="top"/>
+          </w:tcPr>
           <w:p>
             <w:pPr>
               <w:pStyle w:val="Compact"/>
@@ -2552,7 +2781,9 @@
           </w:p>
         </w:tc>
         <w:tc>
-          <w:tcPr/>
+          <w:tcPr>
+            <w:vAlign w:val="top"/>
+          </w:tcPr>
           <w:p>
             <w:pPr>
               <w:pStyle w:val="Compact"/>
@@ -2564,8 +2795,13 @@
         </w:tc>
       </w:tr>
       <w:tr>
-        <w:tc>
-          <w:tcPr/>
+        <w:trPr>
+          <w:cantSplit/>
+        </w:trPr>
+        <w:tc>
+          <w:tcPr>
+            <w:vAlign w:val="top"/>
+          </w:tcPr>
           <w:p>
             <w:pPr>
               <w:pStyle w:val="Compact"/>
@@ -2585,7 +2821,9 @@
           </w:p>
         </w:tc>
         <w:tc>
-          <w:tcPr/>
+          <w:tcPr>
+            <w:vAlign w:val="top"/>
+          </w:tcPr>
           <w:p>
             <w:pPr>
               <w:pStyle w:val="Compact"/>
@@ -2596,7 +2834,9 @@
           </w:p>
         </w:tc>
         <w:tc>
-          <w:tcPr/>
+          <w:tcPr>
+            <w:vAlign w:val="top"/>
+          </w:tcPr>
           <w:p>
             <w:pPr>
               <w:pStyle w:val="Compact"/>
@@ -2607,7 +2847,9 @@
           </w:p>
         </w:tc>
         <w:tc>
-          <w:tcPr/>
+          <w:tcPr>
+            <w:vAlign w:val="top"/>
+          </w:tcPr>
           <w:p>
             <w:pPr>
               <w:pStyle w:val="Compact"/>
@@ -2619,7 +2861,9 @@
           </w:p>
         </w:tc>
         <w:tc>
-          <w:tcPr/>
+          <w:tcPr>
+            <w:vAlign w:val="top"/>
+          </w:tcPr>
           <w:p>
             <w:pPr>
               <w:pStyle w:val="Compact"/>
@@ -2631,8 +2875,13 @@
         </w:tc>
       </w:tr>
       <w:tr>
-        <w:tc>
-          <w:tcPr/>
+        <w:trPr>
+          <w:cantSplit/>
+        </w:trPr>
+        <w:tc>
+          <w:tcPr>
+            <w:vAlign w:val="top"/>
+          </w:tcPr>
           <w:p>
             <w:pPr>
               <w:pStyle w:val="Compact"/>
@@ -2652,7 +2901,9 @@
           </w:p>
         </w:tc>
         <w:tc>
-          <w:tcPr/>
+          <w:tcPr>
+            <w:vAlign w:val="top"/>
+          </w:tcPr>
           <w:p>
             <w:pPr>
               <w:pStyle w:val="Compact"/>
@@ -2663,7 +2914,9 @@
           </w:p>
         </w:tc>
         <w:tc>
-          <w:tcPr/>
+          <w:tcPr>
+            <w:vAlign w:val="top"/>
+          </w:tcPr>
           <w:p>
             <w:pPr>
               <w:pStyle w:val="Compact"/>
@@ -2674,7 +2927,9 @@
           </w:p>
         </w:tc>
         <w:tc>
-          <w:tcPr/>
+          <w:tcPr>
+            <w:vAlign w:val="top"/>
+          </w:tcPr>
           <w:p>
             <w:pPr>
               <w:pStyle w:val="Compact"/>
@@ -2686,7 +2941,9 @@
           </w:p>
         </w:tc>
         <w:tc>
-          <w:tcPr/>
+          <w:tcPr>
+            <w:vAlign w:val="top"/>
+          </w:tcPr>
           <w:p>
             <w:pPr>
               <w:pStyle w:val="Compact"/>
@@ -2698,8 +2955,13 @@
         </w:tc>
       </w:tr>
       <w:tr>
-        <w:tc>
-          <w:tcPr/>
+        <w:trPr>
+          <w:cantSplit/>
+        </w:trPr>
+        <w:tc>
+          <w:tcPr>
+            <w:vAlign w:val="top"/>
+          </w:tcPr>
           <w:p>
             <w:pPr>
               <w:pStyle w:val="Compact"/>
@@ -2719,7 +2981,9 @@
           </w:p>
         </w:tc>
         <w:tc>
-          <w:tcPr/>
+          <w:tcPr>
+            <w:vAlign w:val="top"/>
+          </w:tcPr>
           <w:p>
             <w:pPr>
               <w:pStyle w:val="Compact"/>
@@ -2730,7 +2994,9 @@
           </w:p>
         </w:tc>
         <w:tc>
-          <w:tcPr/>
+          <w:tcPr>
+            <w:vAlign w:val="top"/>
+          </w:tcPr>
           <w:p>
             <w:pPr>
               <w:pStyle w:val="Compact"/>
@@ -2741,7 +3007,9 @@
           </w:p>
         </w:tc>
         <w:tc>
-          <w:tcPr/>
+          <w:tcPr>
+            <w:vAlign w:val="top"/>
+          </w:tcPr>
           <w:p>
             <w:pPr>
               <w:pStyle w:val="Compact"/>
@@ -2753,7 +3021,9 @@
           </w:p>
         </w:tc>
         <w:tc>
-          <w:tcPr/>
+          <w:tcPr>
+            <w:vAlign w:val="top"/>
+          </w:tcPr>
           <w:p>
             <w:pPr>
               <w:pStyle w:val="Compact"/>
@@ -2765,8 +3035,13 @@
         </w:tc>
       </w:tr>
       <w:tr>
-        <w:tc>
-          <w:tcPr/>
+        <w:trPr>
+          <w:cantSplit/>
+        </w:trPr>
+        <w:tc>
+          <w:tcPr>
+            <w:vAlign w:val="top"/>
+          </w:tcPr>
           <w:p>
             <w:pPr>
               <w:pStyle w:val="Compact"/>
@@ -2786,7 +3061,9 @@
           </w:p>
         </w:tc>
         <w:tc>
-          <w:tcPr/>
+          <w:tcPr>
+            <w:vAlign w:val="top"/>
+          </w:tcPr>
           <w:p>
             <w:pPr>
               <w:pStyle w:val="Compact"/>
@@ -2797,7 +3074,9 @@
           </w:p>
         </w:tc>
         <w:tc>
-          <w:tcPr/>
+          <w:tcPr>
+            <w:vAlign w:val="top"/>
+          </w:tcPr>
           <w:p>
             <w:pPr>
               <w:pStyle w:val="Compact"/>
@@ -2808,7 +3087,9 @@
           </w:p>
         </w:tc>
         <w:tc>
-          <w:tcPr/>
+          <w:tcPr>
+            <w:vAlign w:val="top"/>
+          </w:tcPr>
           <w:p>
             <w:pPr>
               <w:pStyle w:val="Compact"/>
@@ -2820,7 +3101,9 @@
           </w:p>
         </w:tc>
         <w:tc>
-          <w:tcPr/>
+          <w:tcPr>
+            <w:vAlign w:val="top"/>
+          </w:tcPr>
           <w:p>
             <w:pPr>
               <w:pStyle w:val="Compact"/>
@@ -2832,8 +3115,13 @@
         </w:tc>
       </w:tr>
       <w:tr>
-        <w:tc>
-          <w:tcPr/>
+        <w:trPr>
+          <w:cantSplit/>
+        </w:trPr>
+        <w:tc>
+          <w:tcPr>
+            <w:vAlign w:val="top"/>
+          </w:tcPr>
           <w:p>
             <w:pPr>
               <w:pStyle w:val="Compact"/>
@@ -2853,7 +3141,9 @@
           </w:p>
         </w:tc>
         <w:tc>
-          <w:tcPr/>
+          <w:tcPr>
+            <w:vAlign w:val="top"/>
+          </w:tcPr>
           <w:p>
             <w:pPr>
               <w:pStyle w:val="Compact"/>
@@ -2864,7 +3154,9 @@
           </w:p>
         </w:tc>
         <w:tc>
-          <w:tcPr/>
+          <w:tcPr>
+            <w:vAlign w:val="top"/>
+          </w:tcPr>
           <w:p>
             <w:pPr>
               <w:pStyle w:val="Compact"/>
@@ -2875,7 +3167,9 @@
           </w:p>
         </w:tc>
         <w:tc>
-          <w:tcPr/>
+          <w:tcPr>
+            <w:vAlign w:val="top"/>
+          </w:tcPr>
           <w:p>
             <w:pPr>
               <w:pStyle w:val="Compact"/>
@@ -2887,7 +3181,9 @@
           </w:p>
         </w:tc>
         <w:tc>
-          <w:tcPr/>
+          <w:tcPr>
+            <w:vAlign w:val="top"/>
+          </w:tcPr>
           <w:p>
             <w:pPr>
               <w:pStyle w:val="Compact"/>
@@ -2899,8 +3195,13 @@
         </w:tc>
       </w:tr>
       <w:tr>
-        <w:tc>
-          <w:tcPr/>
+        <w:trPr>
+          <w:cantSplit/>
+        </w:trPr>
+        <w:tc>
+          <w:tcPr>
+            <w:vAlign w:val="top"/>
+          </w:tcPr>
           <w:p>
             <w:pPr>
               <w:pStyle w:val="Compact"/>
@@ -2920,7 +3221,9 @@
           </w:p>
         </w:tc>
         <w:tc>
-          <w:tcPr/>
+          <w:tcPr>
+            <w:vAlign w:val="top"/>
+          </w:tcPr>
           <w:p>
             <w:pPr>
               <w:pStyle w:val="Compact"/>
@@ -2931,7 +3234,9 @@
           </w:p>
         </w:tc>
         <w:tc>
-          <w:tcPr/>
+          <w:tcPr>
+            <w:vAlign w:val="top"/>
+          </w:tcPr>
           <w:p>
             <w:pPr>
               <w:pStyle w:val="Compact"/>
@@ -2942,7 +3247,9 @@
           </w:p>
         </w:tc>
         <w:tc>
-          <w:tcPr/>
+          <w:tcPr>
+            <w:vAlign w:val="top"/>
+          </w:tcPr>
           <w:p>
             <w:pPr>
               <w:pStyle w:val="Compact"/>
@@ -2954,7 +3261,9 @@
           </w:p>
         </w:tc>
         <w:tc>
-          <w:tcPr/>
+          <w:tcPr>
+            <w:vAlign w:val="top"/>
+          </w:tcPr>
           <w:p>
             <w:pPr>
               <w:pStyle w:val="Compact"/>
@@ -2974,8 +3283,88 @@
         <w:t xml:space="preserve">Exact external subtype replication was not established for C002, C003, C004, or C005. GSE223049 is broad sorted bulk, and E-MTAB-8560 has no fibroblast mapping and no exact mTEC1 label. The external results therefore constrain interpretation rather than convert internal sensitivity into replication.</w:t>
       </w:r>
     </w:p>
-    <w:bookmarkEnd w:id="30"/>
-    <w:bookmarkStart w:id="31" w:name="human-detection-context"/>
+    <w:p>
+      <w:pPr>
+        <w:pStyle w:val="BodyText"/>
+      </w:pPr>
+      <w:r>
+        <w:drawing>
+          <wp:inline>
+            <wp:extent cx="5334000" cy="3200399"/>
+            <wp:effectExtent b="0" l="0" r="0" t="0"/>
+            <wp:docPr descr="Figure 3. External evidence context." title="" id="37" name="Picture"/>
+            <a:graphic>
+              <a:graphicData uri="http://schemas.openxmlformats.org/drawingml/2006/picture">
+                <pic:pic>
+                  <pic:nvPicPr>
+                    <pic:cNvPr descr="../results/figures/v6_final/figure_3_external_evidence_context.png" id="38" name="Picture"/>
+                    <pic:cNvPicPr>
+                      <a:picLocks noChangeArrowheads="1" noChangeAspect="1"/>
+                    </pic:cNvPicPr>
+                  </pic:nvPicPr>
+                  <pic:blipFill>
+                    <a:blip r:embed="rId36"/>
+                    <a:stretch>
+                      <a:fillRect/>
+                    </a:stretch>
+                  </pic:blipFill>
+                  <pic:spPr bwMode="auto">
+                    <a:xfrm>
+                      <a:off x="0" y="0"/>
+                      <a:ext cx="5334000" cy="3200399"/>
+                    </a:xfrm>
+                    <a:prstGeom prst="rect">
+                      <a:avLst/>
+                    </a:prstGeom>
+                    <a:noFill/>
+                    <a:ln w="9525">
+                      <a:noFill/>
+                      <a:headEnd/>
+                      <a:tailEnd/>
+                    </a:ln>
+                  </pic:spPr>
+                </pic:pic>
+              </a:graphicData>
+            </a:graphic>
+          </wp:inline>
+        </w:drawing>
+      </w:r>
+    </w:p>
+    <w:p>
+      <w:pPr>
+        <w:pStyle w:val="BodyText"/>
+      </w:pPr>
+      <w:r>
+        <w:rPr>
+          <w:b/>
+          <w:bCs/>
+        </w:rPr>
+        <w:t xml:space="preserve">Figure 3. External transcript-level evidence context.</w:t>
+      </w:r>
+      <w:r>
+        <w:t xml:space="preserve"> </w:t>
+      </w:r>
+      <w:r>
+        <w:t xml:space="preserve">Sources are the primary GSE240016 sample-level pseudobulk estimates, GSE223049 broad sorted mouse compartments, and E-MTAB-8560 related mouse TEC populations. The analytical units follow each source dataset; the external classifications are descriptive contextual mappings rather than inferential replication tests. Population definitions, technologies, age ranges, and biological units differ, and no external dataset establishes exact capsFB, medFB, or mTEC1 replication. GSE231906 is shown only as a separated</w:t>
+      </w:r>
+      <w:r>
+        <w:t xml:space="preserve"> </w:t>
+      </w:r>
+      <w:r>
+        <w:rPr>
+          <w:rStyle w:val="VerbatimChar"/>
+        </w:rPr>
+        <w:t xml:space="preserve">DETECTION_CONTEXT_ONLY</w:t>
+      </w:r>
+      <w:r>
+        <w:t xml:space="preserve"> </w:t>
+      </w:r>
+      <w:r>
+        <w:t xml:space="preserve">scope annotation and is not age-effect evidence.</w:t>
+      </w:r>
+    </w:p>
+    <w:bookmarkEnd w:id="39"/>
+    <w:bookmarkStart w:id="40" w:name="human-detection-context"/>
     <w:p>
       <w:pPr>
         <w:pStyle w:val="Heading3"/>
@@ -3024,8 +3413,8 @@
         <w:t xml:space="preserve">, not human aging evidence.</w:t>
       </w:r>
     </w:p>
-    <w:bookmarkEnd w:id="31"/>
-    <w:bookmarkStart w:id="32" w:name="evidence-hierarchy"/>
+    <w:bookmarkEnd w:id="40"/>
+    <w:bookmarkStart w:id="41" w:name="evidence-hierarchy"/>
     <w:p>
       <w:pPr>
         <w:pStyle w:val="Heading3"/>
@@ -3039,7 +3428,7 @@
         <w:pStyle w:val="FirstParagraph"/>
       </w:pPr>
       <w:r>
-        <w:t xml:space="preserve">Directly estimated evidence consists of the four sample-level GSE240016 pseudobulk contrasts and their descriptive sample summaries. Internally supported evidence comprises the accepted QC grid, raw/processed representation checks, leave-one-sample-out estimates, Phase 3 matched-null and thinning analyses, and Phase 4 annotation-confidence analyses. These layers share the same biological cohort.</w:t>
+        <w:t xml:space="preserve">Directly estimated evidence consists of the four sample-level GSE240016 pseudobulk contrasts and their descriptive sample summaries. Internally supported evidence comprises the accepted QC grid, raw/processed representation checks, leave-one-sample-out estimates, matched-null and thinning analyses, and annotation-confidence analyses. These layers share the same biological cohort.</w:t>
       </w:r>
     </w:p>
     <w:p>
@@ -3058,8 +3447,8 @@
         <w:t xml:space="preserve">Candidate interpretation includes the statement that a focal association may be useful for an experimental follow-up. No evidence supports protein change, spatial redistribution, altered LOX activity, extracellular-matrix crosslinking, a causal role in involution, treatment response, human conservation, or exact subtype replication.</w:t>
       </w:r>
     </w:p>
-    <w:bookmarkEnd w:id="32"/>
-    <w:bookmarkStart w:id="33" w:name="experimental-prioritization"/>
+    <w:bookmarkEnd w:id="41"/>
+    <w:bookmarkStart w:id="42" w:name="experimental-prioritization"/>
     <w:p>
       <w:pPr>
         <w:pStyle w:val="Heading3"/>
@@ -3085,7 +3474,7 @@
         <w:t xml:space="preserve">Loxl2</w:t>
       </w:r>
       <w:r>
-        <w:t xml:space="preserve">, first because it combines a B+ internal grade with supportive broad fibroblast context. The information-gain scenario ranked C003, medFB</w:t>
+        <w:t xml:space="preserve">, first because it combines B+ internal robustness with supportive broad fibroblast context. The information-gain scenario ranked C003, medFB</w:t>
       </w:r>
       <w:r>
         <w:t xml:space="preserve"> </w:t>
@@ -3109,7 +3498,7 @@
         <w:t xml:space="preserve">Lox</w:t>
       </w:r>
       <w:r>
-        <w:t xml:space="preserve">, first because of grade A internal robustness and a comparatively straightforward broad-context direction. C005, mTEC1</w:t>
+        <w:t xml:space="preserve">, first because of category A internal robustness and a comparatively straightforward broad-context direction. C005, mTEC1</w:t>
       </w:r>
       <w:r>
         <w:t xml:space="preserve"> </w:t>
@@ -3132,9 +3521,9 @@
         <w:t xml:space="preserve">These rankings organize possible assays; they do not prove that the leaders are stronger biological effects. The selected scenario changes the leader, underscoring that the ranking is conditional on planning priorities. No reagent-specific claim is made without manual verification.</w:t>
       </w:r>
     </w:p>
-    <w:bookmarkEnd w:id="33"/>
-    <w:bookmarkEnd w:id="34"/>
-    <w:bookmarkStart w:id="35" w:name="discussion"/>
+    <w:bookmarkEnd w:id="42"/>
+    <w:bookmarkEnd w:id="43"/>
+    <w:bookmarkStart w:id="44" w:name="discussion"/>
     <w:p>
       <w:pPr>
         <w:pStyle w:val="Heading2"/>
@@ -3271,7 +3660,7 @@
         <w:t xml:space="preserve"> </w:t>
       </w:r>
       <w:r>
-        <w:t xml:space="preserve">result is the most statistically and biologically fragile focal association. Its large negative estimate is accompanied by sparse detection, lower aged depth, only two sample labels per age, and no estimable leave-one-out analysis. Phase 3 adds a useful observation: the joint pattern was unusual among technically matched sparse genes and was rarely reproduced by the specified thinning model. This finding narrows one artifact hypothesis but does not remove the broader uncertainties. The grade therefore remains C, and a subtype-resolved detection assay with independently sampled animals would be more informative than further reuse of the same cells.</w:t>
+        <w:t xml:space="preserve">result is the most statistically and biologically fragile focal association. Its large negative estimate is accompanied by sparse detection, lower aged depth, only two sample labels per age, and no estimable leave-one-out analysis. The matched sparse-gene null adds a useful observation: the joint pattern was unusual among technically matched sparse genes and was rarely reproduced by the specified thinning model. This finding narrows one artifact hypothesis but does not remove the broader uncertainties. The internal robustness category therefore remains C, and a subtype-resolved detection assay with independently sampled animals would be more informative than further reuse of the same cells.</w:t>
       </w:r>
     </w:p>
     <w:p>
@@ -3364,7 +3753,7 @@
         <w:pStyle w:val="BodyText"/>
       </w:pPr>
       <w:r>
-        <w:t xml:space="preserve">The Phase 8 framework converts these uncertainties into experimental choices. C004 offers the strongest balance of internal robustness and broad mouse context; C003 offers a high-value test of subtype-versus-compartment direction; C002 offers a practical internally stable pilot; and C005 offers potentially large information gain with substantial failure risk. Such prioritization is useful only if its evidentiary boundary is preserved. A score is not a measured biological quantity.</w:t>
+        <w:t xml:space="preserve">The experimental prioritization framework converts these uncertainties into experimental choices. C004 offers the strongest balance of internal robustness and broad mouse context; C003 offers a high-value test of subtype-versus-compartment direction; C002 offers a practical internally stable pilot; and C005 offers potentially large information gain with substantial failure risk. Such prioritization is useful only if its evidentiary boundary is preserved. A score is not a measured biological quantity.</w:t>
       </w:r>
     </w:p>
     <w:p>
@@ -3375,8 +3764,8 @@
         <w:t xml:space="preserve">The most direct next step would be an independent, balanced mouse cohort with explicit animal-to-library mapping and subtype-resolved measurement. RNA in situ hybridization, spatial transcriptomics, sorted-cell or nucleus-based quantification, and carefully qualified immunostaining could address localization and biological-unit replication. Protein abundance, enzymatic activity, matrix crosslinking, tissue mechanics, and thymic-output assays would be separate questions. The present work establishes neither those endpoints nor a therapeutic direction.</w:t>
       </w:r>
     </w:p>
-    <w:bookmarkEnd w:id="35"/>
-    <w:bookmarkStart w:id="36" w:name="limitations"/>
+    <w:bookmarkEnd w:id="44"/>
+    <w:bookmarkStart w:id="45" w:name="limitations"/>
     <w:p>
       <w:pPr>
         <w:pStyle w:val="Heading2"/>
@@ -3400,8 +3789,8 @@
     <w:tbl>
       <w:tblPr>
         <w:tblStyle w:val="Table"/>
-        <w:tblW w:type="pct" w:w="5000"/>
-        <w:tblLayout w:type="fixed"/>
+        <w:tblW w:type="auto" w:w="0"/>
+        <w:tblLayout w:type="autofit"/>
         <w:tblLook w:firstRow="1" w:lastRow="0" w:firstColumn="0" w:lastColumn="0" w:noHBand="0" w:noVBand="0" w:val="0020"/>
       </w:tblPr>
       <w:tblGrid>
@@ -3412,9 +3801,13 @@
       <w:tr>
         <w:trPr>
           <w:tblHeader w:val="on"/>
+          <w:tblHeader w:val="true"/>
+          <w:cantSplit/>
         </w:trPr>
         <w:tc>
-          <w:tcPr/>
+          <w:tcPr>
+            <w:vAlign w:val="top"/>
+          </w:tcPr>
           <w:p>
             <w:pPr>
               <w:pStyle w:val="Compact"/>
@@ -3425,7 +3818,9 @@
           </w:p>
         </w:tc>
         <w:tc>
-          <w:tcPr/>
+          <w:tcPr>
+            <w:vAlign w:val="top"/>
+          </w:tcPr>
           <w:p>
             <w:pPr>
               <w:pStyle w:val="Compact"/>
@@ -3436,7 +3831,9 @@
           </w:p>
         </w:tc>
         <w:tc>
-          <w:tcPr/>
+          <w:tcPr>
+            <w:vAlign w:val="top"/>
+          </w:tcPr>
           <w:p>
             <w:pPr>
               <w:pStyle w:val="Compact"/>
@@ -3448,8 +3845,13 @@
         </w:tc>
       </w:tr>
       <w:tr>
-        <w:tc>
-          <w:tcPr/>
+        <w:trPr>
+          <w:cantSplit/>
+        </w:trPr>
+        <w:tc>
+          <w:tcPr>
+            <w:vAlign w:val="top"/>
+          </w:tcPr>
           <w:p>
             <w:pPr>
               <w:pStyle w:val="Compact"/>
@@ -3460,7 +3862,9 @@
           </w:p>
         </w:tc>
         <w:tc>
-          <w:tcPr/>
+          <w:tcPr>
+            <w:vAlign w:val="top"/>
+          </w:tcPr>
           <w:p>
             <w:pPr>
               <w:pStyle w:val="Compact"/>
@@ -3471,7 +3875,9 @@
           </w:p>
         </w:tc>
         <w:tc>
-          <w:tcPr/>
+          <w:tcPr>
+            <w:vAlign w:val="top"/>
+          </w:tcPr>
           <w:p>
             <w:pPr>
               <w:pStyle w:val="Compact"/>
@@ -3483,8 +3889,13 @@
         </w:tc>
       </w:tr>
       <w:tr>
-        <w:tc>
-          <w:tcPr/>
+        <w:trPr>
+          <w:cantSplit/>
+        </w:trPr>
+        <w:tc>
+          <w:tcPr>
+            <w:vAlign w:val="top"/>
+          </w:tcPr>
           <w:p>
             <w:pPr>
               <w:pStyle w:val="Compact"/>
@@ -3495,7 +3906,9 @@
           </w:p>
         </w:tc>
         <w:tc>
-          <w:tcPr/>
+          <w:tcPr>
+            <w:vAlign w:val="top"/>
+          </w:tcPr>
           <w:p>
             <w:pPr>
               <w:pStyle w:val="Compact"/>
@@ -3506,7 +3919,9 @@
           </w:p>
         </w:tc>
         <w:tc>
-          <w:tcPr/>
+          <w:tcPr>
+            <w:vAlign w:val="top"/>
+          </w:tcPr>
           <w:p>
             <w:pPr>
               <w:pStyle w:val="Compact"/>
@@ -3518,8 +3933,13 @@
         </w:tc>
       </w:tr>
       <w:tr>
-        <w:tc>
-          <w:tcPr/>
+        <w:trPr>
+          <w:cantSplit/>
+        </w:trPr>
+        <w:tc>
+          <w:tcPr>
+            <w:vAlign w:val="top"/>
+          </w:tcPr>
           <w:p>
             <w:pPr>
               <w:pStyle w:val="Compact"/>
@@ -3530,7 +3950,9 @@
           </w:p>
         </w:tc>
         <w:tc>
-          <w:tcPr/>
+          <w:tcPr>
+            <w:vAlign w:val="top"/>
+          </w:tcPr>
           <w:p>
             <w:pPr>
               <w:pStyle w:val="Compact"/>
@@ -3541,7 +3963,9 @@
           </w:p>
         </w:tc>
         <w:tc>
-          <w:tcPr/>
+          <w:tcPr>
+            <w:vAlign w:val="top"/>
+          </w:tcPr>
           <w:p>
             <w:pPr>
               <w:pStyle w:val="Compact"/>
@@ -3553,8 +3977,13 @@
         </w:tc>
       </w:tr>
       <w:tr>
-        <w:tc>
-          <w:tcPr/>
+        <w:trPr>
+          <w:cantSplit/>
+        </w:trPr>
+        <w:tc>
+          <w:tcPr>
+            <w:vAlign w:val="top"/>
+          </w:tcPr>
           <w:p>
             <w:pPr>
               <w:pStyle w:val="Compact"/>
@@ -3565,7 +3994,9 @@
           </w:p>
         </w:tc>
         <w:tc>
-          <w:tcPr/>
+          <w:tcPr>
+            <w:vAlign w:val="top"/>
+          </w:tcPr>
           <w:p>
             <w:pPr>
               <w:pStyle w:val="Compact"/>
@@ -3591,20 +4022,27 @@
           </w:p>
         </w:tc>
         <w:tc>
-          <w:tcPr/>
-          <w:p>
-            <w:pPr>
-              <w:pStyle w:val="Compact"/>
-            </w:pPr>
-            <w:r>
-              <w:t xml:space="preserve">Grade remains C</w:t>
+          <w:tcPr>
+            <w:vAlign w:val="top"/>
+          </w:tcPr>
+          <w:p>
+            <w:pPr>
+              <w:pStyle w:val="Compact"/>
+            </w:pPr>
+            <w:r>
+              <w:t xml:space="preserve">Internal robustness category remains C</w:t>
             </w:r>
           </w:p>
         </w:tc>
       </w:tr>
       <w:tr>
-        <w:tc>
-          <w:tcPr/>
+        <w:trPr>
+          <w:cantSplit/>
+        </w:trPr>
+        <w:tc>
+          <w:tcPr>
+            <w:vAlign w:val="top"/>
+          </w:tcPr>
           <w:p>
             <w:pPr>
               <w:pStyle w:val="Compact"/>
@@ -3615,7 +4053,9 @@
           </w:p>
         </w:tc>
         <w:tc>
-          <w:tcPr/>
+          <w:tcPr>
+            <w:vAlign w:val="top"/>
+          </w:tcPr>
           <w:p>
             <w:pPr>
               <w:pStyle w:val="Compact"/>
@@ -3626,7 +4066,9 @@
           </w:p>
         </w:tc>
         <w:tc>
-          <w:tcPr/>
+          <w:tcPr>
+            <w:vAlign w:val="top"/>
+          </w:tcPr>
           <w:p>
             <w:pPr>
               <w:pStyle w:val="Compact"/>
@@ -3638,8 +4080,13 @@
         </w:tc>
       </w:tr>
       <w:tr>
-        <w:tc>
-          <w:tcPr/>
+        <w:trPr>
+          <w:cantSplit/>
+        </w:trPr>
+        <w:tc>
+          <w:tcPr>
+            <w:vAlign w:val="top"/>
+          </w:tcPr>
           <w:p>
             <w:pPr>
               <w:pStyle w:val="Compact"/>
@@ -3650,7 +4097,9 @@
           </w:p>
         </w:tc>
         <w:tc>
-          <w:tcPr/>
+          <w:tcPr>
+            <w:vAlign w:val="top"/>
+          </w:tcPr>
           <w:p>
             <w:pPr>
               <w:pStyle w:val="Compact"/>
@@ -3661,7 +4110,9 @@
           </w:p>
         </w:tc>
         <w:tc>
-          <w:tcPr/>
+          <w:tcPr>
+            <w:vAlign w:val="top"/>
+          </w:tcPr>
           <w:p>
             <w:pPr>
               <w:pStyle w:val="Compact"/>
@@ -3673,8 +4124,13 @@
         </w:tc>
       </w:tr>
       <w:tr>
-        <w:tc>
-          <w:tcPr/>
+        <w:trPr>
+          <w:cantSplit/>
+        </w:trPr>
+        <w:tc>
+          <w:tcPr>
+            <w:vAlign w:val="top"/>
+          </w:tcPr>
           <w:p>
             <w:pPr>
               <w:pStyle w:val="Compact"/>
@@ -3685,7 +4141,9 @@
           </w:p>
         </w:tc>
         <w:tc>
-          <w:tcPr/>
+          <w:tcPr>
+            <w:vAlign w:val="top"/>
+          </w:tcPr>
           <w:p>
             <w:pPr>
               <w:pStyle w:val="Compact"/>
@@ -3696,7 +4154,9 @@
           </w:p>
         </w:tc>
         <w:tc>
-          <w:tcPr/>
+          <w:tcPr>
+            <w:vAlign w:val="top"/>
+          </w:tcPr>
           <w:p>
             <w:pPr>
               <w:pStyle w:val="Compact"/>
@@ -3708,8 +4168,13 @@
         </w:tc>
       </w:tr>
       <w:tr>
-        <w:tc>
-          <w:tcPr/>
+        <w:trPr>
+          <w:cantSplit/>
+        </w:trPr>
+        <w:tc>
+          <w:tcPr>
+            <w:vAlign w:val="top"/>
+          </w:tcPr>
           <w:p>
             <w:pPr>
               <w:pStyle w:val="Compact"/>
@@ -3720,7 +4185,9 @@
           </w:p>
         </w:tc>
         <w:tc>
-          <w:tcPr/>
+          <w:tcPr>
+            <w:vAlign w:val="top"/>
+          </w:tcPr>
           <w:p>
             <w:pPr>
               <w:pStyle w:val="Compact"/>
@@ -3731,7 +4198,9 @@
           </w:p>
         </w:tc>
         <w:tc>
-          <w:tcPr/>
+          <w:tcPr>
+            <w:vAlign w:val="top"/>
+          </w:tcPr>
           <w:p>
             <w:pPr>
               <w:pStyle w:val="Compact"/>
@@ -3743,8 +4212,13 @@
         </w:tc>
       </w:tr>
       <w:tr>
-        <w:tc>
-          <w:tcPr/>
+        <w:trPr>
+          <w:cantSplit/>
+        </w:trPr>
+        <w:tc>
+          <w:tcPr>
+            <w:vAlign w:val="top"/>
+          </w:tcPr>
           <w:p>
             <w:pPr>
               <w:pStyle w:val="Compact"/>
@@ -3755,31 +4229,70 @@
           </w:p>
         </w:tc>
         <w:tc>
-          <w:tcPr/>
-          <w:p>
-            <w:pPr>
-              <w:pStyle w:val="Compact"/>
-            </w:pPr>
-            <w:r>
-              <w:t xml:space="preserve">CORE and RELEASE_DERIVED pass; FULL_LOCAL partial</w:t>
-            </w:r>
-          </w:p>
-        </w:tc>
-        <w:tc>
-          <w:tcPr/>
-          <w:p>
-            <w:pPr>
-              <w:pStyle w:val="Compact"/>
-            </w:pPr>
-            <w:r>
-              <w:t xml:space="preserve">No claim of full local reproduction</w:t>
+          <w:tcPr>
+            <w:vAlign w:val="top"/>
+          </w:tcPr>
+          <w:p>
+            <w:pPr>
+              <w:pStyle w:val="Compact"/>
+            </w:pPr>
+            <w:r>
+              <w:t xml:space="preserve">Available Python core reproduced;</w:t>
+            </w:r>
+            <w:r>
+              <w:t xml:space="preserve"> </w:t>
+            </w:r>
+            <w:r>
+              <w:rPr>
+                <w:rStyle w:val="VerbatimChar"/>
+              </w:rPr>
+              <w:t xml:space="preserve">RELEASE_DERIVED</w:t>
+            </w:r>
+            <w:r>
+              <w:t xml:space="preserve"> </w:t>
+            </w:r>
+            <w:r>
+              <w:t xml:space="preserve">passed;</w:t>
+            </w:r>
+            <w:r>
+              <w:t xml:space="preserve"> </w:t>
+            </w:r>
+            <w:r>
+              <w:rPr>
+                <w:rStyle w:val="VerbatimChar"/>
+              </w:rPr>
+              <w:t xml:space="preserve">FULL_LOCAL</w:t>
+            </w:r>
+            <w:r>
+              <w:t xml:space="preserve"> </w:t>
+            </w:r>
+            <w:r>
+              <w:t xml:space="preserve">remained partial</w:t>
+            </w:r>
+          </w:p>
+        </w:tc>
+        <w:tc>
+          <w:tcPr>
+            <w:vAlign w:val="top"/>
+          </w:tcPr>
+          <w:p>
+            <w:pPr>
+              <w:pStyle w:val="Compact"/>
+            </w:pPr>
+            <w:r>
+              <w:t xml:space="preserve">No claim of complete clean-room reproduction</w:t>
             </w:r>
           </w:p>
         </w:tc>
       </w:tr>
       <w:tr>
-        <w:tc>
-          <w:tcPr/>
+        <w:trPr>
+          <w:cantSplit/>
+        </w:trPr>
+        <w:tc>
+          <w:tcPr>
+            <w:vAlign w:val="top"/>
+          </w:tcPr>
           <w:p>
             <w:pPr>
               <w:pStyle w:val="Compact"/>
@@ -3790,7 +4303,9 @@
           </w:p>
         </w:tc>
         <w:tc>
-          <w:tcPr/>
+          <w:tcPr>
+            <w:vAlign w:val="top"/>
+          </w:tcPr>
           <w:p>
             <w:pPr>
               <w:pStyle w:val="Compact"/>
@@ -3801,7 +4316,9 @@
           </w:p>
         </w:tc>
         <w:tc>
-          <w:tcPr/>
+          <w:tcPr>
+            <w:vAlign w:val="top"/>
+          </w:tcPr>
           <w:p>
             <w:pPr>
               <w:pStyle w:val="Compact"/>
@@ -3899,7 +4416,7 @@
         <w:pStyle w:val="BodyText"/>
       </w:pPr>
       <w:r>
-        <w:t xml:space="preserve">The primary method was Python/PyDESeq2. Rscript and the required Bioconductor packages were unavailable in the accepted Phase 1 environment, so edgeR/limma cross-method checks remain blocked. No replacement package versions were installed in Phase 9, and no new statistical estimate was introduced to fill that gap.</w:t>
+        <w:t xml:space="preserve">The primary method was Python/PyDESeq2. Rscript and the required Bioconductor packages were unavailable in the reproducibility-audit environment, so edgeR/limma cross-method checks remain blocked. No replacement package versions were installed during final computational consolidation, and no new statistical estimate was introduced to fill that gap.</w:t>
       </w:r>
     </w:p>
     <w:p>
@@ -3907,7 +4424,7 @@
         <w:pStyle w:val="BodyText"/>
       </w:pPr>
       <w:r>
-        <w:t xml:space="preserve">The analysis relies on published cell annotations. Phase 4 marker scores, confidence tiers, mixed/doublet-like flags, and leave-one-marker-out checks test robustness to one predefined filtering framework. Independent reference mapping was blocked. medFB showed age-asymmetric high-confidence retention, which may reflect altered state, composition, annotation coherence, or technical quality. The preserved focal signs do not resolve those alternatives.</w:t>
+        <w:t xml:space="preserve">The analysis relies on published cell annotations. Marker scores, confidence tiers, mixed/doublet-like flags, and leave-one-marker-out checks test robustness to one predefined filtering framework. Independent reference mapping was blocked. medFB showed age-asymmetric high-confidence retention, which may reflect altered state, composition, annotation coherence, or technical quality. The preserved focal signs do not resolve those alternatives.</w:t>
       </w:r>
     </w:p>
     <w:p>
@@ -3951,22 +4468,22 @@
         <w:pStyle w:val="BodyText"/>
       </w:pPr>
       <w:r>
-        <w:t xml:space="preserve">Clean-room reproducibility is also bounded.</w:t>
-      </w:r>
-      <w:r>
-        <w:t xml:space="preserve"> </w:t>
-      </w:r>
-      <w:r>
-        <w:rPr>
-          <w:rStyle w:val="VerbatimChar"/>
-        </w:rPr>
-        <w:t xml:space="preserve">CORE</w:t>
-      </w:r>
-      <w:r>
-        <w:t xml:space="preserve"> </w:t>
-      </w:r>
-      <w:r>
-        <w:t xml:space="preserve">and</w:t>
+        <w:t xml:space="preserve">Clean-room reproducibility is also bounded. Two isolated</w:t>
+      </w:r>
+      <w:r>
+        <w:t xml:space="preserve"> </w:t>
+      </w:r>
+      <w:r>
+        <w:rPr>
+          <w:rStyle w:val="VerbatimChar"/>
+        </w:rPr>
+        <w:t xml:space="preserve">FULL_LOCAL</w:t>
+      </w:r>
+      <w:r>
+        <w:t xml:space="preserve"> </w:t>
+      </w:r>
+      <w:r>
+        <w:t xml:space="preserve">attempts reproduced the available Python core but remained partial because specified external inputs and the R/Bioconductor environment were unavailable.</w:t>
       </w:r>
       <w:r>
         <w:t xml:space="preserve"> </w:t>
@@ -3981,7 +4498,43 @@
         <w:t xml:space="preserve"> </w:t>
       </w:r>
       <w:r>
-        <w:t xml:space="preserve">pass, with no numeric invariant failures or hidden-state dependence.</w:t>
+        <w:t xml:space="preserve">checks completed without numerical invariant failures. The release therefore does not claim complete clean-room reproduction of every historical workflow.</w:t>
+      </w:r>
+    </w:p>
+    <w:bookmarkEnd w:id="45"/>
+    <w:bookmarkStart w:id="46" w:name="conclusions"/>
+    <w:p>
+      <w:pPr>
+        <w:pStyle w:val="Heading2"/>
+      </w:pPr>
+      <w:r>
+        <w:t xml:space="preserve">Conclusions</w:t>
+      </w:r>
+    </w:p>
+    <w:p>
+      <w:pPr>
+        <w:pStyle w:val="FirstParagraph"/>
+      </w:pPr>
+      <w:r>
+        <w:t xml:space="preserve">GSE240016 contains four focal subtype-associated mouse age-direction estimates that remain directionally stable across accepted internal sensitivity analyses. Independent mouse datasets provide broad or related-subtype context, but no exact subtype replication. The four categories describe internal computational robustness only, GSE231906 contributes detection context only, and experimental prioritization remains a planning layer. Independent biological-unit replication and orthogonal measurements are required before stronger biological interpretation.</w:t>
+      </w:r>
+    </w:p>
+    <w:bookmarkEnd w:id="46"/>
+    <w:bookmarkStart w:id="47" w:name="reproducibility-and-code-availability"/>
+    <w:p>
+      <w:pPr>
+        <w:pStyle w:val="Heading2"/>
+      </w:pPr>
+      <w:r>
+        <w:t xml:space="preserve">Reproducibility and code availability</w:t>
+      </w:r>
+    </w:p>
+    <w:p>
+      <w:pPr>
+        <w:pStyle w:val="FirstParagraph"/>
+      </w:pPr>
+      <w:r>
+        <w:t xml:space="preserve">Scripts, environment specifications, checksums, and reproduction instructions are provided in the versioned repository release. Two isolated</w:t>
       </w:r>
       <w:r>
         <w:t xml:space="preserve"> </w:t>
@@ -3996,77 +4549,22 @@
         <w:t xml:space="preserve"> </w:t>
       </w:r>
       <w:r>
-        <w:t xml:space="preserve">remains</w:t>
-      </w:r>
-      <w:r>
-        <w:t xml:space="preserve"> </w:t>
-      </w:r>
-      <w:r>
-        <w:rPr>
-          <w:rStyle w:val="VerbatimChar"/>
-        </w:rPr>
-        <w:t xml:space="preserve">PARTIAL_REPRODUCTION</w:t>
-      </w:r>
-      <w:r>
-        <w:t xml:space="preserve"> </w:t>
-      </w:r>
-      <w:r>
-        <w:t xml:space="preserve">because some audit-inventory and scope-expansion inputs were unavailable and R/Bioconductor was absent. That status does not invalidate the reproduced Python core, but it prevents a claim that every historical local workflow was fully reproduced.</w:t>
-      </w:r>
-    </w:p>
-    <w:bookmarkEnd w:id="36"/>
-    <w:bookmarkStart w:id="37" w:name="conclusions"/>
-    <w:p>
-      <w:pPr>
-        <w:pStyle w:val="Heading2"/>
-      </w:pPr>
-      <w:r>
-        <w:t xml:space="preserve">Conclusions</w:t>
-      </w:r>
-    </w:p>
-    <w:p>
-      <w:pPr>
-        <w:pStyle w:val="FirstParagraph"/>
-      </w:pPr>
-      <w:r>
-        <w:t xml:space="preserve">GSE240016 contains four focal subtype-associated mouse age-direction estimates that remain directionally stable across accepted internal sensitivity analyses. Independent mouse datasets provide broad or related-subtype context, but no exact subtype replication. The four grades describe internal computational robustness only, GSE231906 contributes detection context only, and experimental prioritization remains a planning layer. Independent biological-unit replication and orthogonal measurements are required before stronger biological interpretation.</w:t>
-      </w:r>
-    </w:p>
-    <w:bookmarkEnd w:id="37"/>
-    <w:bookmarkStart w:id="38" w:name="reproducibility-and-code-availability"/>
-    <w:p>
-      <w:pPr>
-        <w:pStyle w:val="Heading2"/>
-      </w:pPr>
-      <w:r>
-        <w:t xml:space="preserve">Reproducibility and code availability</w:t>
-      </w:r>
-    </w:p>
-    <w:p>
-      <w:pPr>
-        <w:pStyle w:val="FirstParagraph"/>
-      </w:pPr>
-      <w:r>
-        <w:t xml:space="preserve">The repository provides a top-level freeze command:</w:t>
-      </w:r>
-    </w:p>
-    <w:p>
-      <w:pPr>
-        <w:pStyle w:val="BodyText"/>
-      </w:pPr>
-      <w:r>
-        <w:rPr>
-          <w:rStyle w:val="VerbatimChar"/>
-        </w:rPr>
-        <w:t xml:space="preserve">python scripts/run_phase9_final_computational_freeze.py</w:t>
-      </w:r>
-    </w:p>
-    <w:p>
-      <w:pPr>
-        <w:pStyle w:val="BodyText"/>
-      </w:pPr>
-      <w:r>
-        <w:t xml:space="preserve">This command validates frozen inputs and accepted artifacts, performs the authorized Phase 3 provenance normalization and Phase 5 report regeneration, builds final tables and registries, renders the manuscript, runs cross-file and wording checks, audits checksums, and exits nonzero on a critical inconsistency. The Phase 1 clean-room audit records exact package versions, input checksums, dependency lineage, comparison policies, numerical tolerances, two-run hidden-state checks, blockers, and mode-specific verdicts.</w:t>
+        <w:t xml:space="preserve">attempts reproduced the available Python core but remained partial because specified external inputs and the R/Bioconductor environment were unavailable.</w:t>
+      </w:r>
+      <w:r>
+        <w:t xml:space="preserve"> </w:t>
+      </w:r>
+      <w:r>
+        <w:rPr>
+          <w:rStyle w:val="VerbatimChar"/>
+        </w:rPr>
+        <w:t xml:space="preserve">RELEASE_DERIVED</w:t>
+      </w:r>
+      <w:r>
+        <w:t xml:space="preserve"> </w:t>
+      </w:r>
+      <w:r>
+        <w:t xml:space="preserve">checks completed without numerical invariant failures. The release therefore does not claim complete clean-room reproduction of every historical workflow.</w:t>
       </w:r>
     </w:p>
     <w:p>
@@ -4091,8 +4589,8 @@
         <w:t xml:space="preserve">.</w:t>
       </w:r>
     </w:p>
-    <w:bookmarkEnd w:id="38"/>
-    <w:bookmarkStart w:id="39" w:name="data-availability"/>
+    <w:bookmarkEnd w:id="47"/>
+    <w:bookmarkStart w:id="48" w:name="data-availability"/>
     <w:p>
       <w:pPr>
         <w:pStyle w:val="Heading2"/>
@@ -4109,8 +4607,8 @@
         <w:t xml:space="preserve">GSE240016, GSE223049, and GSE231906 are available from the NCBI Gene Expression Omnibus under their accession records [6,20,22]. E-MTAB-8560 is available through ArrayExpress/BioStudies and its associated processed resource [19]. Third-party datasets remain subject to their source licenses and distribution terms. The final dataset input manifest records dataset role, local availability, size, checksum, clean-room staging status, provenance, and the effect of absence. Large public inputs are not necessarily redistributed in the release candidate.</w:t>
       </w:r>
     </w:p>
-    <w:bookmarkEnd w:id="39"/>
-    <w:bookmarkStart w:id="40" w:name="author-contributions"/>
+    <w:bookmarkEnd w:id="48"/>
+    <w:bookmarkStart w:id="49" w:name="author-contributions"/>
     <w:p>
       <w:pPr>
         <w:pStyle w:val="Heading2"/>
@@ -4127,8 +4625,8 @@
         <w:t xml:space="preserve">Aliaksandr Karatseyeu conceived the reanalysis, implemented and audited the computational workflows, interpreted the accepted results, and wrote the manuscript.</w:t>
       </w:r>
     </w:p>
-    <w:bookmarkEnd w:id="40"/>
-    <w:bookmarkStart w:id="41" w:name="competing-interests"/>
+    <w:bookmarkEnd w:id="49"/>
+    <w:bookmarkStart w:id="50" w:name="competing-interests"/>
     <w:p>
       <w:pPr>
         <w:pStyle w:val="Heading2"/>
@@ -4145,8 +4643,8 @@
         <w:t xml:space="preserve">The author declares no competing interests.</w:t>
       </w:r>
     </w:p>
-    <w:bookmarkEnd w:id="41"/>
-    <w:bookmarkStart w:id="42" w:name="funding"/>
+    <w:bookmarkEnd w:id="50"/>
+    <w:bookmarkStart w:id="51" w:name="funding"/>
     <w:p>
       <w:pPr>
         <w:pStyle w:val="Heading2"/>
@@ -4163,8 +4661,8 @@
         <w:t xml:space="preserve">This work received no external funding.</w:t>
       </w:r>
     </w:p>
-    <w:bookmarkEnd w:id="42"/>
-    <w:bookmarkStart w:id="67" w:name="references"/>
+    <w:bookmarkEnd w:id="51"/>
+    <w:bookmarkStart w:id="76" w:name="references"/>
     <w:p>
       <w:pPr>
         <w:pStyle w:val="Heading2"/>
@@ -4203,7 +4701,7 @@
       <w:r>
         <w:t xml:space="preserve"> </w:t>
       </w:r>
-      <w:hyperlink r:id="rId43">
+      <w:hyperlink r:id="rId52">
         <w:r>
           <w:rPr>
             <w:rStyle w:val="Hyperlink"/>
@@ -4245,7 +4743,7 @@
       <w:r>
         <w:t xml:space="preserve"> </w:t>
       </w:r>
-      <w:hyperlink r:id="rId44">
+      <w:hyperlink r:id="rId53">
         <w:r>
           <w:rPr>
             <w:rStyle w:val="Hyperlink"/>
@@ -4266,7 +4764,7 @@
         </w:numPr>
       </w:pPr>
       <w:r>
-        <w:t xml:space="preserve">Ki S, Park D, Selden HJ, Seita J, Chung H, Kim J, et al. Global transcriptional profiling reveals distinct functions of thymic stromal subsets and age-related changes during thymic involution.</w:t>
+        <w:t xml:space="preserve">Ki S, Park D, Selden HJ, Seita J, Chung H, Kim J, et al. Global transcriptional profiling reveals distinct functions of thymic stromal subsets and age-related changes during thymic involution.</w:t>
       </w:r>
       <w:r>
         <w:t xml:space="preserve"> </w:t>
@@ -4287,7 +4785,7 @@
       <w:r>
         <w:t xml:space="preserve"> </w:t>
       </w:r>
-      <w:hyperlink r:id="rId45">
+      <w:hyperlink r:id="rId54">
         <w:r>
           <w:rPr>
             <w:rStyle w:val="Hyperlink"/>
@@ -4329,7 +4827,7 @@
       <w:r>
         <w:t xml:space="preserve"> </w:t>
       </w:r>
-      <w:hyperlink r:id="rId46">
+      <w:hyperlink r:id="rId55">
         <w:r>
           <w:rPr>
             <w:rStyle w:val="Hyperlink"/>
@@ -4350,7 +4848,7 @@
         </w:numPr>
       </w:pPr>
       <w:r>
-        <w:t xml:space="preserve">Kousa AI, Jahn L, Zhao K, Flores AE, Acenas D, Lederer E, et al. Age-related epithelial defects limit thymic function and regeneration.</w:t>
+        <w:t xml:space="preserve">Kousa AI, Jahn L, Zhao K, Flores AE, Acenas D, Lederer E, et al. Age-related epithelial defects limit thymic function and regeneration.</w:t>
       </w:r>
       <w:r>
         <w:t xml:space="preserve"> </w:t>
@@ -4371,7 +4869,7 @@
       <w:r>
         <w:t xml:space="preserve"> </w:t>
       </w:r>
-      <w:hyperlink r:id="rId47">
+      <w:hyperlink r:id="rId56">
         <w:r>
           <w:rPr>
             <w:rStyle w:val="Hyperlink"/>
@@ -4397,7 +4895,7 @@
       <w:r>
         <w:t xml:space="preserve"> </w:t>
       </w:r>
-      <w:hyperlink r:id="rId48">
+      <w:hyperlink r:id="rId57">
         <w:r>
           <w:rPr>
             <w:rStyle w:val="Hyperlink"/>
@@ -4439,7 +4937,7 @@
       <w:r>
         <w:t xml:space="preserve"> </w:t>
       </w:r>
-      <w:hyperlink r:id="rId49">
+      <w:hyperlink r:id="rId58">
         <w:r>
           <w:rPr>
             <w:rStyle w:val="Hyperlink"/>
@@ -4481,7 +4979,7 @@
       <w:r>
         <w:t xml:space="preserve"> </w:t>
       </w:r>
-      <w:hyperlink r:id="rId50">
+      <w:hyperlink r:id="rId59">
         <w:r>
           <w:rPr>
             <w:rStyle w:val="Hyperlink"/>
@@ -4523,7 +5021,7 @@
       <w:r>
         <w:t xml:space="preserve"> </w:t>
       </w:r>
-      <w:hyperlink r:id="rId51">
+      <w:hyperlink r:id="rId60">
         <w:r>
           <w:rPr>
             <w:rStyle w:val="Hyperlink"/>
@@ -4565,7 +5063,7 @@
       <w:r>
         <w:t xml:space="preserve"> </w:t>
       </w:r>
-      <w:hyperlink r:id="rId52">
+      <w:hyperlink r:id="rId61">
         <w:r>
           <w:rPr>
             <w:rStyle w:val="Hyperlink"/>
@@ -4586,7 +5084,7 @@
         </w:numPr>
       </w:pPr>
       <w:r>
-        <w:t xml:space="preserve">Liu X, Zhao Y, Gao J, Pawlyk B, Starcher B, Spencer JA, et al. Elastic fiber homeostasis requires lysyl oxidase-like 1 protein.</w:t>
+        <w:t xml:space="preserve">Liu X, Zhao Y, Gao J, Pawlyk B, Starcher B, Spencer JA, et al. Elastic fiber homeostasis requires lysyl oxidase-like 1 protein.</w:t>
       </w:r>
       <w:r>
         <w:t xml:space="preserve"> </w:t>
@@ -4607,7 +5105,7 @@
       <w:r>
         <w:t xml:space="preserve"> </w:t>
       </w:r>
-      <w:hyperlink r:id="rId53">
+      <w:hyperlink r:id="rId62">
         <w:r>
           <w:rPr>
             <w:rStyle w:val="Hyperlink"/>
@@ -4649,7 +5147,7 @@
       <w:r>
         <w:t xml:space="preserve"> </w:t>
       </w:r>
-      <w:hyperlink r:id="rId54">
+      <w:hyperlink r:id="rId63">
         <w:r>
           <w:rPr>
             <w:rStyle w:val="Hyperlink"/>
@@ -4670,7 +5168,7 @@
         </w:numPr>
       </w:pPr>
       <w:r>
-        <w:t xml:space="preserve">Bignon M, Pichol-Thievend C, Hardouin J, Malbouyres M, Brechot N, Nasciutti L, et al. Lysyl oxidase-like protein-2 regulates sprouting angiogenesis and type IV collagen assembly.</w:t>
+        <w:t xml:space="preserve">Bignon M, Pichol-Thievend C, Hardouin J, Malbouyres M, Brechot N, Nasciutti L, et al. Lysyl oxidase-like protein-2 regulates sprouting angiogenesis and type IV collagen assembly.</w:t>
       </w:r>
       <w:r>
         <w:t xml:space="preserve"> </w:t>
@@ -4691,7 +5189,7 @@
       <w:r>
         <w:t xml:space="preserve"> </w:t>
       </w:r>
-      <w:hyperlink r:id="rId55">
+      <w:hyperlink r:id="rId64">
         <w:r>
           <w:rPr>
             <w:rStyle w:val="Hyperlink"/>
@@ -4712,7 +5210,7 @@
         </w:numPr>
       </w:pPr>
       <w:r>
-        <w:t xml:space="preserve">Crowell HL, Soneson C, Germain PL, Calini D, Collin L, Raposo C, et al. muscat detects subpopulation-specific state transitions from multi-sample multi-condition single-cell transcriptomics data.</w:t>
+        <w:t xml:space="preserve">Crowell HL, Soneson C, Germain PL, Calini D, Collin L, Raposo C, et al. muscat detects subpopulation-specific state transitions from multi-sample multi-condition single-cell transcriptomics data.</w:t>
       </w:r>
       <w:r>
         <w:t xml:space="preserve"> </w:t>
@@ -4733,7 +5231,7 @@
       <w:r>
         <w:t xml:space="preserve"> </w:t>
       </w:r>
-      <w:hyperlink r:id="rId56">
+      <w:hyperlink r:id="rId65">
         <w:r>
           <w:rPr>
             <w:rStyle w:val="Hyperlink"/>
@@ -4754,7 +5252,7 @@
         </w:numPr>
       </w:pPr>
       <w:r>
-        <w:t xml:space="preserve">Squair JW, Gautier M, Kathe C, Anderson MA, James ND, Hutson TH, et al. Confronting false discoveries in single-cell differential expression.</w:t>
+        <w:t xml:space="preserve">Squair JW, Gautier M, Kathe C, Anderson MA, James ND, Hutson TH, et al. Confronting false discoveries in single-cell differential expression.</w:t>
       </w:r>
       <w:r>
         <w:t xml:space="preserve"> </w:t>
@@ -4775,7 +5273,7 @@
       <w:r>
         <w:t xml:space="preserve"> </w:t>
       </w:r>
-      <w:hyperlink r:id="rId57">
+      <w:hyperlink r:id="rId66">
         <w:r>
           <w:rPr>
             <w:rStyle w:val="Hyperlink"/>
@@ -4817,7 +5315,7 @@
       <w:r>
         <w:t xml:space="preserve"> </w:t>
       </w:r>
-      <w:hyperlink r:id="rId58">
+      <w:hyperlink r:id="rId67">
         <w:r>
           <w:rPr>
             <w:rStyle w:val="Hyperlink"/>
@@ -4859,7 +5357,7 @@
       <w:r>
         <w:t xml:space="preserve"> </w:t>
       </w:r>
-      <w:hyperlink r:id="rId59">
+      <w:hyperlink r:id="rId68">
         <w:r>
           <w:rPr>
             <w:rStyle w:val="Hyperlink"/>
@@ -4901,7 +5399,7 @@
       <w:r>
         <w:t xml:space="preserve"> </w:t>
       </w:r>
-      <w:hyperlink r:id="rId60">
+      <w:hyperlink r:id="rId69">
         <w:r>
           <w:rPr>
             <w:rStyle w:val="Hyperlink"/>
@@ -4922,7 +5420,7 @@
         </w:numPr>
       </w:pPr>
       <w:r>
-        <w:t xml:space="preserve">Baran-Gale J, Morgan MD, Maio S, Dhalla F, Calvo-Asensio I, Deadman ME, et al. Ageing compromises mouse thymus function and remodels epithelial cell differentiation.</w:t>
+        <w:t xml:space="preserve">Baran-Gale J, Morgan MD, Maio S, Dhalla F, Calvo-Asensio I, Deadman ME, et al. Ageing compromises mouse thymus function and remodels epithelial cell differentiation.</w:t>
       </w:r>
       <w:r>
         <w:t xml:space="preserve"> </w:t>
@@ -4943,7 +5441,7 @@
       <w:r>
         <w:t xml:space="preserve"> </w:t>
       </w:r>
-      <w:hyperlink r:id="rId61">
+      <w:hyperlink r:id="rId70">
         <w:r>
           <w:rPr>
             <w:rStyle w:val="Hyperlink"/>
@@ -4957,7 +5455,7 @@
       <w:r>
         <w:t xml:space="preserve"> </w:t>
       </w:r>
-      <w:hyperlink r:id="rId62">
+      <w:hyperlink r:id="rId71">
         <w:r>
           <w:rPr>
             <w:rStyle w:val="Hyperlink"/>
@@ -4983,7 +5481,7 @@
       <w:r>
         <w:t xml:space="preserve"> </w:t>
       </w:r>
-      <w:hyperlink r:id="rId63">
+      <w:hyperlink r:id="rId72">
         <w:r>
           <w:rPr>
             <w:rStyle w:val="Hyperlink"/>
@@ -5025,7 +5523,7 @@
       <w:r>
         <w:t xml:space="preserve"> </w:t>
       </w:r>
-      <w:hyperlink r:id="rId64">
+      <w:hyperlink r:id="rId73">
         <w:r>
           <w:rPr>
             <w:rStyle w:val="Hyperlink"/>
@@ -5051,7 +5549,7 @@
       <w:r>
         <w:t xml:space="preserve"> </w:t>
       </w:r>
-      <w:hyperlink r:id="rId65">
+      <w:hyperlink r:id="rId74">
         <w:r>
           <w:rPr>
             <w:rStyle w:val="Hyperlink"/>
@@ -5093,7 +5591,7 @@
       <w:r>
         <w:t xml:space="preserve"> </w:t>
       </w:r>
-      <w:hyperlink r:id="rId66">
+      <w:hyperlink r:id="rId75">
         <w:r>
           <w:rPr>
             <w:rStyle w:val="Hyperlink"/>
@@ -5105,8 +5603,8 @@
         <w:t xml:space="preserve">.</w:t>
       </w:r>
     </w:p>
-    <w:bookmarkEnd w:id="67"/>
-    <w:bookmarkStart w:id="68" w:name="supplementary-materials-map"/>
+    <w:bookmarkEnd w:id="76"/>
+    <w:bookmarkStart w:id="77" w:name="supplementary-materials-map"/>
     <w:p>
       <w:pPr>
         <w:pStyle w:val="Heading2"/>
@@ -5199,7 +5697,7 @@
         </w:numPr>
       </w:pPr>
       <w:r>
-        <w:t xml:space="preserve">Phase 2 robustness: QC-grid, raw-versus-processed, leave-one-out, blocker, and focal-grade tables under</w:t>
+        <w:t xml:space="preserve">Internal robustness analyses (Phase 2 provenance): QC-grid, raw-versus-processed, leave-one-out, blocker, and focal-category tables under</w:t>
       </w:r>
       <w:r>
         <w:t xml:space="preserve"> </w:t>
@@ -5223,7 +5721,7 @@
         </w:numPr>
       </w:pPr>
       <w:r>
-        <w:t xml:space="preserve">Phase 3 sparse-null outputs: matched-pool, extremeness, thinning-simulation, invariant, and final-verdict tables, with</w:t>
+        <w:t xml:space="preserve">Matched sparse-gene null analysis (Phase 3 provenance): matched-pool, extremeness, thinning-simulation, invariant, and final-verdict tables, with</w:t>
       </w:r>
       <w:r>
         <w:t xml:space="preserve"> </w:t>
@@ -5247,7 +5745,7 @@
         </w:numPr>
       </w:pPr>
       <w:r>
-        <w:t xml:space="preserve">Phase 4 annotation outputs: confidence-tier, leave-one-marker-out, retention-asymmetry, pseudobulk, and final-verdict tables.</w:t>
+        <w:t xml:space="preserve">Annotation-confidence analysis (Phase 4 provenance): confidence-tier, leave-one-marker-out, retention-asymmetry, pseudobulk, and final-verdict tables.</w:t>
       </w:r>
     </w:p>
     <w:p>
@@ -5274,7 +5772,7 @@
         <w:t xml:space="preserve"> </w:t>
       </w:r>
       <w:r>
-        <w:t xml:space="preserve">and accepted GSE223049/E-MTAB-8560 Phase 5 tables.</w:t>
+        <w:t xml:space="preserve">and accepted GSE223049/E-MTAB-8560 Phase 5 provenance tables.</w:t>
       </w:r>
     </w:p>
     <w:p>
@@ -5286,7 +5784,7 @@
         </w:numPr>
       </w:pPr>
       <w:r>
-        <w:t xml:space="preserve">Human detection context: the GSE231906 join, identity, count-semantics, detection, and Phase 0/6A integrity tables.</w:t>
+        <w:t xml:space="preserve">Human detection context: the GSE231906 join, identity, count-semantics, detection, and Phase 0/6A provenance tables.</w:t>
       </w:r>
     </w:p>
     <w:p>
@@ -5346,7 +5844,7 @@
         </w:numPr>
       </w:pPr>
       <w:r>
-        <w:t xml:space="preserve">Experimental planning: Phase 8 component-score, scenario-weight, ranking, sensitivity, assay, and validation-plan tables.</w:t>
+        <w:t xml:space="preserve">Experimental prioritization framework (Phase 8 provenance): component-score, scenario-weight, ranking, sensitivity, assay, and validation-plan tables.</w:t>
       </w:r>
     </w:p>
     <w:p>
@@ -5382,7 +5880,7 @@
         </w:numPr>
       </w:pPr>
       <w:r>
-        <w:t xml:space="preserve">Final freeze:</w:t>
+        <w:t xml:space="preserve">Final computational consolidation (Phase 9 provenance):</w:t>
       </w:r>
       <w:r>
         <w:t xml:space="preserve"> </w:t>
@@ -5394,15 +5892,30 @@
         <w:t xml:space="preserve">manifests/final_authoritative_file_registry_v6.tsv</w:t>
       </w:r>
       <w:r>
-        <w:t xml:space="preserve">, release-asset manifest, checksum index, cross-file consistency table, and Phase 9 reports.</w:t>
-      </w:r>
-    </w:p>
-    <w:bookmarkEnd w:id="68"/>
-    <w:bookmarkEnd w:id="69"/>
+        <w:t xml:space="preserve">, release-asset manifest, checksum index, cross-file consistency table, and Phase 9 reports. The repository command is</w:t>
+      </w:r>
+      <w:r>
+        <w:t xml:space="preserve"> </w:t>
+      </w:r>
+      <w:r>
+        <w:rPr>
+          <w:rStyle w:val="VerbatimChar"/>
+        </w:rPr>
+        <w:t xml:space="preserve">python scripts/run_phase9_final_computational_freeze.py</w:t>
+      </w:r>
+      <w:r>
+        <w:t xml:space="preserve">.</w:t>
+      </w:r>
+    </w:p>
+    <w:bookmarkEnd w:id="77"/>
+    <w:bookmarkEnd w:id="78"/>
     <w:sectPr>
+      <w:footerReference w:type="default" r:id="rId11"/>
       <w:footnotePr>
         <w:numRestart w:val="eachSect"/>
       </w:footnotePr>
+      <w:pgSz w:w="11906" w:h="16838"/>
+      <w:pgMar w:top="1020" w:bottom="1020" w:left="1020" w:right="1020" w:footer="454"/>
     </w:sectPr>
   </w:body>
 </w:document>
@@ -5410,6 +5923,29 @@
 
 <file path=word/comments.xml><?xml version="1.0" encoding="utf-8"?>
 <w:comments xmlns:w="http://schemas.openxmlformats.org/wordprocessingml/2006/main" xmlns:m="http://schemas.openxmlformats.org/officeDocument/2006/math" xmlns:r="http://schemas.openxmlformats.org/officeDocument/2006/relationships" xmlns:o="urn:schemas-microsoft-com:office:office" xmlns:v="urn:schemas-microsoft-com:vml" xmlns:w10="urn:schemas-microsoft-com:office:word" xmlns:a="http://schemas.openxmlformats.org/drawingml/2006/main" xmlns:pic="http://schemas.openxmlformats.org/drawingml/2006/picture" xmlns:wp="http://schemas.openxmlformats.org/drawingml/2006/wordprocessingDrawing"/>
+</file>
+
+<file path=word/footer1.xml><?xml version="1.0" encoding="utf-8"?>
+<w:ftr xmlns:m="http://schemas.openxmlformats.org/officeDocument/2006/math" xmlns:mc="http://schemas.openxmlformats.org/markup-compatibility/2006" xmlns:mo="http://schemas.microsoft.com/office/mac/office/2008/main" xmlns:mv="urn:schemas-microsoft-com:mac:vml" xmlns:o="urn:schemas-microsoft-com:office:office" xmlns:r="http://schemas.openxmlformats.org/officeDocument/2006/relationships" xmlns:v="urn:schemas-microsoft-com:vml" xmlns:w10="urn:schemas-microsoft-com:office:word" xmlns:w14="http://schemas.microsoft.com/office/word/2010/wordml" xmlns:w="http://schemas.openxmlformats.org/wordprocessingml/2006/main" xmlns:wne="http://schemas.microsoft.com/office/word/2006/wordml" xmlns:wp14="http://schemas.microsoft.com/office/word/2010/wordprocessingDrawing" xmlns:wp="http://schemas.openxmlformats.org/drawingml/2006/wordprocessingDrawing" xmlns:wpc="http://schemas.microsoft.com/office/word/2010/wordprocessingCanvas" xmlns:wpg="http://schemas.microsoft.com/office/word/2010/wordprocessingGroup" xmlns:wpi="http://schemas.microsoft.com/office/word/2010/wordprocessingInk" xmlns:wps="http://schemas.microsoft.com/office/word/2010/wordprocessingShape" mc:Ignorable="w14 wp14">
+  <w:p>
+    <w:pPr>
+      <w:pStyle w:val="Footer"/>
+      <w:jc w:val="center"/>
+    </w:pPr>
+    <w:r>
+      <w:rPr>
+        <w:rFonts w:ascii="Arial" w:hAnsi="Arial"/>
+        <w:color w:val="5A5A5A"/>
+        <w:sz w:val="18"/>
+      </w:rPr>
+      <w:fldChar w:fldCharType="begin"/>
+      <w:instrText xml:space="preserve"> PAGE </w:instrText>
+      <w:fldChar w:fldCharType="separate"/>
+      <w:t>1</w:t>
+      <w:fldChar w:fldCharType="end"/>
+    </w:r>
+  </w:p>
+</w:ftr>
 </file>
 
 <file path=word/footnotes.xml><?xml version="1.0" encoding="utf-8"?>
@@ -5744,7 +6280,7 @@
         <w:rFonts w:asciiTheme="minorHAnsi" w:cstheme="minorBidi" w:eastAsiaTheme="minorEastAsia" w:hAnsiTheme="minorHAnsi"/>
         <w:sz w:val="24"/>
         <w:szCs w:val="24"/>
-        <w:lang w:bidi="ar-SA" w:eastAsia="zh-CN" w:val="en-US"/>
+        <w:lang w:bidi="ar-SA" w:eastAsia="zh-CN" w:val="en"/>
       </w:rPr>
     </w:rPrDefault>
     <w:pPrDefault>
@@ -5757,6 +6293,13 @@
   <w:style w:default="1" w:styleId="Normal" w:type="paragraph">
     <w:name w:val="Normal"/>
     <w:qFormat/>
+    <w:pPr>
+      <w:spacing w:after="120" w:line="259" w:lineRule="auto"/>
+    </w:pPr>
+    <w:rPr>
+      <w:rFonts w:ascii="Arial" w:hAnsi="Arial"/>
+      <w:sz w:val="21"/>
+    </w:rPr>
   </w:style>
   <w:style w:styleId="BodyText" w:type="paragraph">
     <w:name w:val="Body Text"/>
@@ -5790,13 +6333,16 @@
     <w:qFormat/>
     <w:rsid w:val="00A10FD9"/>
     <w:pPr>
+      <w:keepNext/>
       <w:spacing w:after="80" w:line="240" w:lineRule="auto"/>
       <w:contextualSpacing/>
       <w:jc w:val="center"/>
     </w:pPr>
     <w:rPr>
-      <w:rFonts w:asciiTheme="majorHAnsi" w:cstheme="majorBidi" w:eastAsiaTheme="majorEastAsia" w:hAnsiTheme="majorHAnsi"/>
-      <w:sz w:val="56"/>
+      <w:rFonts w:asciiTheme="majorHAnsi" w:cstheme="majorBidi" w:eastAsiaTheme="majorEastAsia" w:hAnsiTheme="majorHAnsi" w:ascii="Arial" w:hAnsi="Arial"/>
+      <w:b/>
+      <w:color w:val="17365D"/>
+      <w:sz w:val="44"/>
       <w:szCs w:val="56"/>
     </w:rPr>
   </w:style>
@@ -5929,9 +6475,10 @@
       <w:outlineLvl w:val="0"/>
     </w:pPr>
     <w:rPr>
-      <w:rFonts w:asciiTheme="majorHAnsi" w:cstheme="majorBidi" w:eastAsiaTheme="majorEastAsia" w:hAnsiTheme="majorHAnsi"/>
-      <w:color w:themeColor="accent1" w:themeShade="BF" w:val="0F4761"/>
-      <w:sz w:val="40"/>
+      <w:rFonts w:asciiTheme="majorHAnsi" w:cstheme="majorBidi" w:eastAsiaTheme="majorEastAsia" w:hAnsiTheme="majorHAnsi" w:ascii="Arial" w:hAnsi="Arial"/>
+      <w:b/>
+      <w:color w:val="17365D"/>
+      <w:sz w:val="30"/>
       <w:szCs w:val="40"/>
     </w:rPr>
   </w:style>
@@ -5952,9 +6499,10 @@
       <w:outlineLvl w:val="1"/>
     </w:pPr>
     <w:rPr>
-      <w:rFonts w:asciiTheme="majorHAnsi" w:cstheme="majorBidi" w:eastAsiaTheme="majorEastAsia" w:hAnsiTheme="majorHAnsi"/>
-      <w:color w:themeColor="accent1" w:themeShade="BF" w:val="0F4761"/>
-      <w:sz w:val="32"/>
+      <w:rFonts w:asciiTheme="majorHAnsi" w:cstheme="majorBidi" w:eastAsiaTheme="majorEastAsia" w:hAnsiTheme="majorHAnsi" w:ascii="Arial" w:hAnsi="Arial"/>
+      <w:b/>
+      <w:color w:val="244F78"/>
+      <w:sz w:val="24"/>
       <w:szCs w:val="32"/>
     </w:rPr>
   </w:style>

</xml_diff>